<commit_message>
preparación de la clase del 21 de abril de 2026
</commit_message>
<xml_diff>
--- a/3_lenguaje_proposicional/clase_02_analisis_del_lenguaje/1_estrategia_filtracion_selectiva.docx
+++ b/3_lenguaje_proposicional/clase_02_analisis_del_lenguaje/1_estrategia_filtracion_selectiva.docx
@@ -16,26 +16,3632 @@
           <w:bCs/>
           <w:lang w:val="es-ES"/>
         </w:rPr>
-        <w:t xml:space="preserve">La estrategia de </w:t>
+        <w:t>La estrategia de filt</w:t>
       </w:r>
-      <w:proofErr w:type="spellStart"/>
       <w:r>
         <w:rPr>
           <w:b/>
           <w:bCs/>
           <w:lang w:val="es-ES"/>
         </w:rPr>
-        <w:t>filtación</w:t>
+        <w:t>r</w:t>
       </w:r>
-      <w:proofErr w:type="spellEnd"/>
       <w:r>
         <w:rPr>
           <w:b/>
           <w:bCs/>
           <w:lang w:val="es-ES"/>
         </w:rPr>
-        <w:t xml:space="preserve"> selectiva  </w:t>
+        <w:t xml:space="preserve">ación selectiva  </w:t>
       </w:r>
+    </w:p>
+    <w:p>
+      <w:pPr>
+        <w:rPr>
+          <w:b/>
+          <w:bCs/>
+          <w:lang w:val="es-ES"/>
+        </w:rPr>
+      </w:pPr>
+    </w:p>
+    <w:p>
+      <w:pPr>
+        <w:rPr>
+          <w:b/>
+          <w:bCs/>
+        </w:rPr>
+      </w:pPr>
+      <w:r>
+        <w:rPr>
+          <w:b/>
+          <w:bCs/>
+        </w:rPr>
+        <w:t>Este ejercicio es perfecto para entrenar la discriminación visual y la lógica de conjuntos (intersección) aplicada a tablas de datos. Aquí tienes el material listo para tus estudiantes.</w:t>
+      </w:r>
+    </w:p>
+    <w:p>
+      <w:pPr>
+        <w:rPr>
+          <w:b/>
+          <w:bCs/>
+        </w:rPr>
+      </w:pPr>
+      <w:r>
+        <w:rPr>
+          <w:b/>
+          <w:bCs/>
+        </w:rPr>
+        <w:pict w14:anchorId="79D6D856">
+          <v:rect id="_x0000_i1085" style="width:0;height:1.5pt" o:hralign="center" o:hrstd="t" o:hrnoshade="t" o:hr="t" fillcolor="gray" stroked="f"/>
+        </w:pict>
+      </w:r>
+    </w:p>
+    <w:p>
+      <w:pPr>
+        <w:rPr>
+          <w:b/>
+          <w:bCs/>
+        </w:rPr>
+      </w:pPr>
+      <w:r>
+        <w:rPr>
+          <w:b/>
+          <w:bCs/>
+        </w:rPr>
+        <w:t>1. Transcripción y Edición de los Enunciados</w:t>
+      </w:r>
+    </w:p>
+    <w:p>
+      <w:pPr>
+        <w:rPr>
+          <w:b/>
+          <w:bCs/>
+        </w:rPr>
+      </w:pPr>
+      <w:r>
+        <w:rPr>
+          <w:b/>
+          <w:bCs/>
+        </w:rPr>
+        <w:t>Contexto: El cuadro muestra los resultados de una investigación sobre 5 plantas ($E_1, E_2, E_3, E_4, E_5$) en tres de sus partes: raíz, hoja y fruto; y 7 sustancias ($R_1, R_2, H_1, H_2, H_3, F_1, F_2$) presentes en ellas. El símbolo "V" indica la presencia de la sustancia.</w:t>
+      </w:r>
+    </w:p>
+    <w:p>
+      <w:pPr>
+        <w:rPr>
+          <w:b/>
+          <w:bCs/>
+        </w:rPr>
+      </w:pPr>
+      <w:r>
+        <w:rPr>
+          <w:b/>
+          <w:bCs/>
+        </w:rPr>
+        <w:t>Tabla de Datos (Reconstruida)</w:t>
+      </w:r>
+    </w:p>
+    <w:tbl>
+      <w:tblPr>
+        <w:tblW w:w="0" w:type="auto"/>
+        <w:tblCellSpacing w:w="15" w:type="dxa"/>
+        <w:tblCellMar>
+          <w:left w:w="0" w:type="dxa"/>
+          <w:right w:w="0" w:type="dxa"/>
+        </w:tblCellMar>
+        <w:tblLook w:val="04A0" w:firstRow="1" w:lastRow="0" w:firstColumn="1" w:lastColumn="0" w:noHBand="0" w:noVBand="1"/>
+      </w:tblPr>
+      <w:tblGrid>
+        <w:gridCol w:w="955"/>
+        <w:gridCol w:w="1329"/>
+        <w:gridCol w:w="506"/>
+        <w:gridCol w:w="506"/>
+        <w:gridCol w:w="506"/>
+        <w:gridCol w:w="506"/>
+        <w:gridCol w:w="341"/>
+      </w:tblGrid>
+      <w:tr>
+        <w:trPr>
+          <w:tblHeader/>
+          <w:tblCellSpacing w:w="15" w:type="dxa"/>
+        </w:trPr>
+        <w:tc>
+          <w:tcPr>
+            <w:tcW w:w="0" w:type="auto"/>
+            <w:tcBorders>
+              <w:top w:val="single" w:sz="6" w:space="0" w:color="auto"/>
+              <w:left w:val="single" w:sz="6" w:space="0" w:color="auto"/>
+              <w:bottom w:val="single" w:sz="6" w:space="0" w:color="auto"/>
+              <w:right w:val="single" w:sz="6" w:space="0" w:color="auto"/>
+            </w:tcBorders>
+            <w:tcMar>
+              <w:top w:w="240" w:type="dxa"/>
+              <w:left w:w="0" w:type="dxa"/>
+              <w:bottom w:w="240" w:type="dxa"/>
+              <w:right w:w="180" w:type="dxa"/>
+            </w:tcMar>
+            <w:vAlign w:val="center"/>
+            <w:hideMark/>
+          </w:tcPr>
+          <w:p>
+            <w:pPr>
+              <w:rPr>
+                <w:b/>
+                <w:bCs/>
+              </w:rPr>
+            </w:pPr>
+            <w:r>
+              <w:rPr>
+                <w:b/>
+                <w:bCs/>
+              </w:rPr>
+              <w:t>Partes</w:t>
+            </w:r>
+          </w:p>
+        </w:tc>
+        <w:tc>
+          <w:tcPr>
+            <w:tcW w:w="0" w:type="auto"/>
+            <w:tcBorders>
+              <w:top w:val="single" w:sz="6" w:space="0" w:color="auto"/>
+              <w:left w:val="single" w:sz="6" w:space="0" w:color="auto"/>
+              <w:bottom w:val="single" w:sz="6" w:space="0" w:color="auto"/>
+              <w:right w:val="single" w:sz="6" w:space="0" w:color="auto"/>
+            </w:tcBorders>
+            <w:tcMar>
+              <w:top w:w="240" w:type="dxa"/>
+              <w:left w:w="0" w:type="dxa"/>
+              <w:bottom w:w="240" w:type="dxa"/>
+              <w:right w:w="180" w:type="dxa"/>
+            </w:tcMar>
+            <w:vAlign w:val="center"/>
+            <w:hideMark/>
+          </w:tcPr>
+          <w:p>
+            <w:pPr>
+              <w:rPr>
+                <w:b/>
+                <w:bCs/>
+              </w:rPr>
+            </w:pPr>
+            <w:r>
+              <w:rPr>
+                <w:b/>
+                <w:bCs/>
+              </w:rPr>
+              <w:t>Sustancia</w:t>
+            </w:r>
+          </w:p>
+        </w:tc>
+        <w:tc>
+          <w:tcPr>
+            <w:tcW w:w="0" w:type="auto"/>
+            <w:tcBorders>
+              <w:top w:val="single" w:sz="6" w:space="0" w:color="auto"/>
+              <w:left w:val="single" w:sz="6" w:space="0" w:color="auto"/>
+              <w:bottom w:val="single" w:sz="6" w:space="0" w:color="auto"/>
+              <w:right w:val="single" w:sz="6" w:space="0" w:color="auto"/>
+            </w:tcBorders>
+            <w:tcMar>
+              <w:top w:w="240" w:type="dxa"/>
+              <w:left w:w="0" w:type="dxa"/>
+              <w:bottom w:w="240" w:type="dxa"/>
+              <w:right w:w="180" w:type="dxa"/>
+            </w:tcMar>
+            <w:vAlign w:val="center"/>
+            <w:hideMark/>
+          </w:tcPr>
+          <w:p>
+            <w:pPr>
+              <w:rPr>
+                <w:b/>
+                <w:bCs/>
+              </w:rPr>
+            </w:pPr>
+            <w:r>
+              <w:rPr>
+                <w:b/>
+                <w:bCs/>
+              </w:rPr>
+              <w:t>E1</w:t>
+            </w:r>
+            <w:r>
+              <w:rPr>
+                <w:rFonts w:ascii="Arial" w:hAnsi="Arial" w:cs="Arial"/>
+                <w:b/>
+                <w:bCs/>
+              </w:rPr>
+              <w:t>​</w:t>
+            </w:r>
+          </w:p>
+        </w:tc>
+        <w:tc>
+          <w:tcPr>
+            <w:tcW w:w="0" w:type="auto"/>
+            <w:tcBorders>
+              <w:top w:val="single" w:sz="6" w:space="0" w:color="auto"/>
+              <w:left w:val="single" w:sz="6" w:space="0" w:color="auto"/>
+              <w:bottom w:val="single" w:sz="6" w:space="0" w:color="auto"/>
+              <w:right w:val="single" w:sz="6" w:space="0" w:color="auto"/>
+            </w:tcBorders>
+            <w:tcMar>
+              <w:top w:w="240" w:type="dxa"/>
+              <w:left w:w="0" w:type="dxa"/>
+              <w:bottom w:w="240" w:type="dxa"/>
+              <w:right w:w="180" w:type="dxa"/>
+            </w:tcMar>
+            <w:vAlign w:val="center"/>
+            <w:hideMark/>
+          </w:tcPr>
+          <w:p>
+            <w:pPr>
+              <w:rPr>
+                <w:b/>
+                <w:bCs/>
+              </w:rPr>
+            </w:pPr>
+            <w:r>
+              <w:rPr>
+                <w:b/>
+                <w:bCs/>
+              </w:rPr>
+              <w:t>E2</w:t>
+            </w:r>
+            <w:r>
+              <w:rPr>
+                <w:rFonts w:ascii="Arial" w:hAnsi="Arial" w:cs="Arial"/>
+                <w:b/>
+                <w:bCs/>
+              </w:rPr>
+              <w:t>​</w:t>
+            </w:r>
+          </w:p>
+        </w:tc>
+        <w:tc>
+          <w:tcPr>
+            <w:tcW w:w="0" w:type="auto"/>
+            <w:tcBorders>
+              <w:top w:val="single" w:sz="6" w:space="0" w:color="auto"/>
+              <w:left w:val="single" w:sz="6" w:space="0" w:color="auto"/>
+              <w:bottom w:val="single" w:sz="6" w:space="0" w:color="auto"/>
+              <w:right w:val="single" w:sz="6" w:space="0" w:color="auto"/>
+            </w:tcBorders>
+            <w:tcMar>
+              <w:top w:w="240" w:type="dxa"/>
+              <w:left w:w="0" w:type="dxa"/>
+              <w:bottom w:w="240" w:type="dxa"/>
+              <w:right w:w="180" w:type="dxa"/>
+            </w:tcMar>
+            <w:vAlign w:val="center"/>
+            <w:hideMark/>
+          </w:tcPr>
+          <w:p>
+            <w:pPr>
+              <w:rPr>
+                <w:b/>
+                <w:bCs/>
+              </w:rPr>
+            </w:pPr>
+            <w:r>
+              <w:rPr>
+                <w:b/>
+                <w:bCs/>
+              </w:rPr>
+              <w:t>E3</w:t>
+            </w:r>
+            <w:r>
+              <w:rPr>
+                <w:rFonts w:ascii="Arial" w:hAnsi="Arial" w:cs="Arial"/>
+                <w:b/>
+                <w:bCs/>
+              </w:rPr>
+              <w:t>​</w:t>
+            </w:r>
+          </w:p>
+        </w:tc>
+        <w:tc>
+          <w:tcPr>
+            <w:tcW w:w="0" w:type="auto"/>
+            <w:tcBorders>
+              <w:top w:val="single" w:sz="6" w:space="0" w:color="auto"/>
+              <w:left w:val="single" w:sz="6" w:space="0" w:color="auto"/>
+              <w:bottom w:val="single" w:sz="6" w:space="0" w:color="auto"/>
+              <w:right w:val="single" w:sz="6" w:space="0" w:color="auto"/>
+            </w:tcBorders>
+            <w:tcMar>
+              <w:top w:w="240" w:type="dxa"/>
+              <w:left w:w="0" w:type="dxa"/>
+              <w:bottom w:w="240" w:type="dxa"/>
+              <w:right w:w="180" w:type="dxa"/>
+            </w:tcMar>
+            <w:vAlign w:val="center"/>
+            <w:hideMark/>
+          </w:tcPr>
+          <w:p>
+            <w:pPr>
+              <w:rPr>
+                <w:b/>
+                <w:bCs/>
+              </w:rPr>
+            </w:pPr>
+            <w:r>
+              <w:rPr>
+                <w:b/>
+                <w:bCs/>
+              </w:rPr>
+              <w:t>E4</w:t>
+            </w:r>
+            <w:r>
+              <w:rPr>
+                <w:rFonts w:ascii="Arial" w:hAnsi="Arial" w:cs="Arial"/>
+                <w:b/>
+                <w:bCs/>
+              </w:rPr>
+              <w:t>​</w:t>
+            </w:r>
+          </w:p>
+        </w:tc>
+        <w:tc>
+          <w:tcPr>
+            <w:tcW w:w="0" w:type="auto"/>
+            <w:tcBorders>
+              <w:top w:val="single" w:sz="6" w:space="0" w:color="auto"/>
+              <w:left w:val="single" w:sz="6" w:space="0" w:color="auto"/>
+              <w:bottom w:val="single" w:sz="6" w:space="0" w:color="auto"/>
+              <w:right w:val="single" w:sz="6" w:space="0" w:color="auto"/>
+            </w:tcBorders>
+            <w:tcMar>
+              <w:top w:w="240" w:type="dxa"/>
+              <w:left w:w="0" w:type="dxa"/>
+              <w:bottom w:w="240" w:type="dxa"/>
+              <w:right w:w="0" w:type="dxa"/>
+            </w:tcMar>
+            <w:vAlign w:val="center"/>
+            <w:hideMark/>
+          </w:tcPr>
+          <w:p>
+            <w:pPr>
+              <w:rPr>
+                <w:b/>
+                <w:bCs/>
+              </w:rPr>
+            </w:pPr>
+            <w:r>
+              <w:rPr>
+                <w:b/>
+                <w:bCs/>
+              </w:rPr>
+              <w:t>E5</w:t>
+            </w:r>
+            <w:r>
+              <w:rPr>
+                <w:rFonts w:ascii="Arial" w:hAnsi="Arial" w:cs="Arial"/>
+                <w:b/>
+                <w:bCs/>
+              </w:rPr>
+              <w:t>​</w:t>
+            </w:r>
+          </w:p>
+        </w:tc>
+      </w:tr>
+      <w:tr>
+        <w:trPr>
+          <w:tblCellSpacing w:w="15" w:type="dxa"/>
+        </w:trPr>
+        <w:tc>
+          <w:tcPr>
+            <w:tcW w:w="0" w:type="auto"/>
+            <w:tcBorders>
+              <w:top w:val="single" w:sz="6" w:space="0" w:color="auto"/>
+              <w:left w:val="single" w:sz="6" w:space="0" w:color="auto"/>
+              <w:bottom w:val="single" w:sz="6" w:space="0" w:color="auto"/>
+              <w:right w:val="single" w:sz="6" w:space="0" w:color="auto"/>
+            </w:tcBorders>
+            <w:tcMar>
+              <w:top w:w="240" w:type="dxa"/>
+              <w:left w:w="0" w:type="dxa"/>
+              <w:bottom w:w="240" w:type="dxa"/>
+              <w:right w:w="180" w:type="dxa"/>
+            </w:tcMar>
+            <w:vAlign w:val="center"/>
+            <w:hideMark/>
+          </w:tcPr>
+          <w:p>
+            <w:pPr>
+              <w:rPr>
+                <w:b/>
+                <w:bCs/>
+              </w:rPr>
+            </w:pPr>
+            <w:r>
+              <w:rPr>
+                <w:b/>
+                <w:bCs/>
+              </w:rPr>
+              <w:t>Raíz</w:t>
+            </w:r>
+          </w:p>
+        </w:tc>
+        <w:tc>
+          <w:tcPr>
+            <w:tcW w:w="0" w:type="auto"/>
+            <w:tcBorders>
+              <w:top w:val="single" w:sz="6" w:space="0" w:color="auto"/>
+              <w:left w:val="single" w:sz="6" w:space="0" w:color="auto"/>
+              <w:bottom w:val="single" w:sz="6" w:space="0" w:color="auto"/>
+              <w:right w:val="single" w:sz="6" w:space="0" w:color="auto"/>
+            </w:tcBorders>
+            <w:tcMar>
+              <w:top w:w="240" w:type="dxa"/>
+              <w:left w:w="0" w:type="dxa"/>
+              <w:bottom w:w="240" w:type="dxa"/>
+              <w:right w:w="180" w:type="dxa"/>
+            </w:tcMar>
+            <w:vAlign w:val="center"/>
+            <w:hideMark/>
+          </w:tcPr>
+          <w:p>
+            <w:pPr>
+              <w:rPr>
+                <w:b/>
+                <w:bCs/>
+              </w:rPr>
+            </w:pPr>
+            <w:r>
+              <w:rPr>
+                <w:b/>
+                <w:bCs/>
+              </w:rPr>
+              <w:t>$R_1$</w:t>
+            </w:r>
+          </w:p>
+        </w:tc>
+        <w:tc>
+          <w:tcPr>
+            <w:tcW w:w="0" w:type="auto"/>
+            <w:tcBorders>
+              <w:top w:val="single" w:sz="6" w:space="0" w:color="auto"/>
+              <w:left w:val="single" w:sz="6" w:space="0" w:color="auto"/>
+              <w:bottom w:val="single" w:sz="6" w:space="0" w:color="auto"/>
+              <w:right w:val="single" w:sz="6" w:space="0" w:color="auto"/>
+            </w:tcBorders>
+            <w:tcMar>
+              <w:top w:w="240" w:type="dxa"/>
+              <w:left w:w="0" w:type="dxa"/>
+              <w:bottom w:w="240" w:type="dxa"/>
+              <w:right w:w="180" w:type="dxa"/>
+            </w:tcMar>
+            <w:vAlign w:val="center"/>
+            <w:hideMark/>
+          </w:tcPr>
+          <w:p>
+            <w:pPr>
+              <w:rPr>
+                <w:b/>
+                <w:bCs/>
+              </w:rPr>
+            </w:pPr>
+            <w:r>
+              <w:rPr>
+                <w:b/>
+                <w:bCs/>
+              </w:rPr>
+              <w:t>V</w:t>
+            </w:r>
+          </w:p>
+        </w:tc>
+        <w:tc>
+          <w:tcPr>
+            <w:tcW w:w="0" w:type="auto"/>
+            <w:tcBorders>
+              <w:top w:val="single" w:sz="6" w:space="0" w:color="auto"/>
+              <w:left w:val="single" w:sz="6" w:space="0" w:color="auto"/>
+              <w:bottom w:val="single" w:sz="6" w:space="0" w:color="auto"/>
+              <w:right w:val="single" w:sz="6" w:space="0" w:color="auto"/>
+            </w:tcBorders>
+            <w:tcMar>
+              <w:top w:w="240" w:type="dxa"/>
+              <w:left w:w="0" w:type="dxa"/>
+              <w:bottom w:w="240" w:type="dxa"/>
+              <w:right w:w="180" w:type="dxa"/>
+            </w:tcMar>
+            <w:vAlign w:val="center"/>
+            <w:hideMark/>
+          </w:tcPr>
+          <w:p>
+            <w:pPr>
+              <w:rPr>
+                <w:b/>
+                <w:bCs/>
+              </w:rPr>
+            </w:pPr>
+            <w:r>
+              <w:rPr>
+                <w:b/>
+                <w:bCs/>
+              </w:rPr>
+              <w:t>V</w:t>
+            </w:r>
+          </w:p>
+        </w:tc>
+        <w:tc>
+          <w:tcPr>
+            <w:tcW w:w="0" w:type="auto"/>
+            <w:tcBorders>
+              <w:top w:val="single" w:sz="6" w:space="0" w:color="auto"/>
+              <w:left w:val="single" w:sz="6" w:space="0" w:color="auto"/>
+              <w:bottom w:val="single" w:sz="6" w:space="0" w:color="auto"/>
+              <w:right w:val="single" w:sz="6" w:space="0" w:color="auto"/>
+            </w:tcBorders>
+            <w:tcMar>
+              <w:top w:w="240" w:type="dxa"/>
+              <w:left w:w="0" w:type="dxa"/>
+              <w:bottom w:w="240" w:type="dxa"/>
+              <w:right w:w="180" w:type="dxa"/>
+            </w:tcMar>
+            <w:vAlign w:val="center"/>
+            <w:hideMark/>
+          </w:tcPr>
+          <w:p>
+            <w:pPr>
+              <w:rPr>
+                <w:b/>
+                <w:bCs/>
+              </w:rPr>
+            </w:pPr>
+            <w:r>
+              <w:rPr>
+                <w:b/>
+                <w:bCs/>
+              </w:rPr>
+              <w:t>V</w:t>
+            </w:r>
+          </w:p>
+        </w:tc>
+        <w:tc>
+          <w:tcPr>
+            <w:tcW w:w="0" w:type="auto"/>
+            <w:tcBorders>
+              <w:top w:val="single" w:sz="6" w:space="0" w:color="auto"/>
+              <w:left w:val="single" w:sz="6" w:space="0" w:color="auto"/>
+              <w:bottom w:val="single" w:sz="6" w:space="0" w:color="auto"/>
+              <w:right w:val="single" w:sz="6" w:space="0" w:color="auto"/>
+            </w:tcBorders>
+            <w:tcMar>
+              <w:top w:w="240" w:type="dxa"/>
+              <w:left w:w="0" w:type="dxa"/>
+              <w:bottom w:w="240" w:type="dxa"/>
+              <w:right w:w="180" w:type="dxa"/>
+            </w:tcMar>
+            <w:vAlign w:val="center"/>
+            <w:hideMark/>
+          </w:tcPr>
+          <w:p>
+            <w:pPr>
+              <w:rPr>
+                <w:b/>
+                <w:bCs/>
+              </w:rPr>
+            </w:pPr>
+            <w:r>
+              <w:rPr>
+                <w:b/>
+                <w:bCs/>
+              </w:rPr>
+              <w:t>V</w:t>
+            </w:r>
+          </w:p>
+        </w:tc>
+        <w:tc>
+          <w:tcPr>
+            <w:tcW w:w="0" w:type="auto"/>
+            <w:tcBorders>
+              <w:top w:val="single" w:sz="6" w:space="0" w:color="auto"/>
+              <w:left w:val="single" w:sz="6" w:space="0" w:color="auto"/>
+              <w:bottom w:val="single" w:sz="6" w:space="0" w:color="auto"/>
+              <w:right w:val="single" w:sz="6" w:space="0" w:color="auto"/>
+            </w:tcBorders>
+            <w:tcMar>
+              <w:top w:w="240" w:type="dxa"/>
+              <w:left w:w="0" w:type="dxa"/>
+              <w:bottom w:w="240" w:type="dxa"/>
+              <w:right w:w="0" w:type="dxa"/>
+            </w:tcMar>
+            <w:vAlign w:val="center"/>
+            <w:hideMark/>
+          </w:tcPr>
+          <w:p>
+            <w:pPr>
+              <w:rPr>
+                <w:b/>
+                <w:bCs/>
+              </w:rPr>
+            </w:pPr>
+          </w:p>
+        </w:tc>
+      </w:tr>
+      <w:tr>
+        <w:trPr>
+          <w:tblCellSpacing w:w="15" w:type="dxa"/>
+        </w:trPr>
+        <w:tc>
+          <w:tcPr>
+            <w:tcW w:w="0" w:type="auto"/>
+            <w:tcBorders>
+              <w:top w:val="single" w:sz="6" w:space="0" w:color="auto"/>
+              <w:left w:val="single" w:sz="6" w:space="0" w:color="auto"/>
+              <w:bottom w:val="single" w:sz="6" w:space="0" w:color="auto"/>
+              <w:right w:val="single" w:sz="6" w:space="0" w:color="auto"/>
+            </w:tcBorders>
+            <w:tcMar>
+              <w:top w:w="240" w:type="dxa"/>
+              <w:left w:w="0" w:type="dxa"/>
+              <w:bottom w:w="240" w:type="dxa"/>
+              <w:right w:w="180" w:type="dxa"/>
+            </w:tcMar>
+            <w:vAlign w:val="center"/>
+            <w:hideMark/>
+          </w:tcPr>
+          <w:p>
+            <w:pPr>
+              <w:rPr>
+                <w:b/>
+                <w:bCs/>
+              </w:rPr>
+            </w:pPr>
+          </w:p>
+        </w:tc>
+        <w:tc>
+          <w:tcPr>
+            <w:tcW w:w="0" w:type="auto"/>
+            <w:tcBorders>
+              <w:top w:val="single" w:sz="6" w:space="0" w:color="auto"/>
+              <w:left w:val="single" w:sz="6" w:space="0" w:color="auto"/>
+              <w:bottom w:val="single" w:sz="6" w:space="0" w:color="auto"/>
+              <w:right w:val="single" w:sz="6" w:space="0" w:color="auto"/>
+            </w:tcBorders>
+            <w:tcMar>
+              <w:top w:w="240" w:type="dxa"/>
+              <w:left w:w="0" w:type="dxa"/>
+              <w:bottom w:w="240" w:type="dxa"/>
+              <w:right w:w="180" w:type="dxa"/>
+            </w:tcMar>
+            <w:vAlign w:val="center"/>
+            <w:hideMark/>
+          </w:tcPr>
+          <w:p>
+            <w:pPr>
+              <w:rPr>
+                <w:b/>
+                <w:bCs/>
+              </w:rPr>
+            </w:pPr>
+            <w:r>
+              <w:rPr>
+                <w:b/>
+                <w:bCs/>
+              </w:rPr>
+              <w:t>$R_2$</w:t>
+            </w:r>
+          </w:p>
+        </w:tc>
+        <w:tc>
+          <w:tcPr>
+            <w:tcW w:w="0" w:type="auto"/>
+            <w:tcBorders>
+              <w:top w:val="single" w:sz="6" w:space="0" w:color="auto"/>
+              <w:left w:val="single" w:sz="6" w:space="0" w:color="auto"/>
+              <w:bottom w:val="single" w:sz="6" w:space="0" w:color="auto"/>
+              <w:right w:val="single" w:sz="6" w:space="0" w:color="auto"/>
+            </w:tcBorders>
+            <w:tcMar>
+              <w:top w:w="240" w:type="dxa"/>
+              <w:left w:w="0" w:type="dxa"/>
+              <w:bottom w:w="240" w:type="dxa"/>
+              <w:right w:w="180" w:type="dxa"/>
+            </w:tcMar>
+            <w:vAlign w:val="center"/>
+            <w:hideMark/>
+          </w:tcPr>
+          <w:p>
+            <w:pPr>
+              <w:rPr>
+                <w:b/>
+                <w:bCs/>
+              </w:rPr>
+            </w:pPr>
+            <w:r>
+              <w:rPr>
+                <w:b/>
+                <w:bCs/>
+              </w:rPr>
+              <w:t>V</w:t>
+            </w:r>
+          </w:p>
+        </w:tc>
+        <w:tc>
+          <w:tcPr>
+            <w:tcW w:w="0" w:type="auto"/>
+            <w:tcBorders>
+              <w:top w:val="single" w:sz="6" w:space="0" w:color="auto"/>
+              <w:left w:val="single" w:sz="6" w:space="0" w:color="auto"/>
+              <w:bottom w:val="single" w:sz="6" w:space="0" w:color="auto"/>
+              <w:right w:val="single" w:sz="6" w:space="0" w:color="auto"/>
+            </w:tcBorders>
+            <w:tcMar>
+              <w:top w:w="240" w:type="dxa"/>
+              <w:left w:w="0" w:type="dxa"/>
+              <w:bottom w:w="240" w:type="dxa"/>
+              <w:right w:w="180" w:type="dxa"/>
+            </w:tcMar>
+            <w:vAlign w:val="center"/>
+            <w:hideMark/>
+          </w:tcPr>
+          <w:p>
+            <w:pPr>
+              <w:rPr>
+                <w:b/>
+                <w:bCs/>
+              </w:rPr>
+            </w:pPr>
+          </w:p>
+        </w:tc>
+        <w:tc>
+          <w:tcPr>
+            <w:tcW w:w="0" w:type="auto"/>
+            <w:tcBorders>
+              <w:top w:val="single" w:sz="6" w:space="0" w:color="auto"/>
+              <w:left w:val="single" w:sz="6" w:space="0" w:color="auto"/>
+              <w:bottom w:val="single" w:sz="6" w:space="0" w:color="auto"/>
+              <w:right w:val="single" w:sz="6" w:space="0" w:color="auto"/>
+            </w:tcBorders>
+            <w:tcMar>
+              <w:top w:w="240" w:type="dxa"/>
+              <w:left w:w="0" w:type="dxa"/>
+              <w:bottom w:w="240" w:type="dxa"/>
+              <w:right w:w="180" w:type="dxa"/>
+            </w:tcMar>
+            <w:vAlign w:val="center"/>
+            <w:hideMark/>
+          </w:tcPr>
+          <w:p>
+            <w:pPr>
+              <w:rPr>
+                <w:b/>
+                <w:bCs/>
+              </w:rPr>
+            </w:pPr>
+            <w:r>
+              <w:rPr>
+                <w:b/>
+                <w:bCs/>
+              </w:rPr>
+              <w:t>V</w:t>
+            </w:r>
+          </w:p>
+        </w:tc>
+        <w:tc>
+          <w:tcPr>
+            <w:tcW w:w="0" w:type="auto"/>
+            <w:tcBorders>
+              <w:top w:val="single" w:sz="6" w:space="0" w:color="auto"/>
+              <w:left w:val="single" w:sz="6" w:space="0" w:color="auto"/>
+              <w:bottom w:val="single" w:sz="6" w:space="0" w:color="auto"/>
+              <w:right w:val="single" w:sz="6" w:space="0" w:color="auto"/>
+            </w:tcBorders>
+            <w:tcMar>
+              <w:top w:w="240" w:type="dxa"/>
+              <w:left w:w="0" w:type="dxa"/>
+              <w:bottom w:w="240" w:type="dxa"/>
+              <w:right w:w="180" w:type="dxa"/>
+            </w:tcMar>
+            <w:vAlign w:val="center"/>
+            <w:hideMark/>
+          </w:tcPr>
+          <w:p>
+            <w:pPr>
+              <w:rPr>
+                <w:b/>
+                <w:bCs/>
+              </w:rPr>
+            </w:pPr>
+            <w:r>
+              <w:rPr>
+                <w:b/>
+                <w:bCs/>
+              </w:rPr>
+              <w:t>V</w:t>
+            </w:r>
+          </w:p>
+        </w:tc>
+        <w:tc>
+          <w:tcPr>
+            <w:tcW w:w="0" w:type="auto"/>
+            <w:tcBorders>
+              <w:top w:val="single" w:sz="6" w:space="0" w:color="auto"/>
+              <w:left w:val="single" w:sz="6" w:space="0" w:color="auto"/>
+              <w:bottom w:val="single" w:sz="6" w:space="0" w:color="auto"/>
+              <w:right w:val="single" w:sz="6" w:space="0" w:color="auto"/>
+            </w:tcBorders>
+            <w:tcMar>
+              <w:top w:w="240" w:type="dxa"/>
+              <w:left w:w="0" w:type="dxa"/>
+              <w:bottom w:w="240" w:type="dxa"/>
+              <w:right w:w="0" w:type="dxa"/>
+            </w:tcMar>
+            <w:vAlign w:val="center"/>
+            <w:hideMark/>
+          </w:tcPr>
+          <w:p>
+            <w:pPr>
+              <w:rPr>
+                <w:b/>
+                <w:bCs/>
+              </w:rPr>
+            </w:pPr>
+            <w:r>
+              <w:rPr>
+                <w:b/>
+                <w:bCs/>
+              </w:rPr>
+              <w:t>V</w:t>
+            </w:r>
+          </w:p>
+        </w:tc>
+      </w:tr>
+      <w:tr>
+        <w:trPr>
+          <w:tblCellSpacing w:w="15" w:type="dxa"/>
+        </w:trPr>
+        <w:tc>
+          <w:tcPr>
+            <w:tcW w:w="0" w:type="auto"/>
+            <w:tcBorders>
+              <w:top w:val="single" w:sz="6" w:space="0" w:color="auto"/>
+              <w:left w:val="single" w:sz="6" w:space="0" w:color="auto"/>
+              <w:bottom w:val="single" w:sz="6" w:space="0" w:color="auto"/>
+              <w:right w:val="single" w:sz="6" w:space="0" w:color="auto"/>
+            </w:tcBorders>
+            <w:tcMar>
+              <w:top w:w="240" w:type="dxa"/>
+              <w:left w:w="0" w:type="dxa"/>
+              <w:bottom w:w="240" w:type="dxa"/>
+              <w:right w:w="180" w:type="dxa"/>
+            </w:tcMar>
+            <w:vAlign w:val="center"/>
+            <w:hideMark/>
+          </w:tcPr>
+          <w:p>
+            <w:pPr>
+              <w:rPr>
+                <w:b/>
+                <w:bCs/>
+              </w:rPr>
+            </w:pPr>
+            <w:r>
+              <w:rPr>
+                <w:b/>
+                <w:bCs/>
+              </w:rPr>
+              <w:t>Hoja</w:t>
+            </w:r>
+          </w:p>
+        </w:tc>
+        <w:tc>
+          <w:tcPr>
+            <w:tcW w:w="0" w:type="auto"/>
+            <w:tcBorders>
+              <w:top w:val="single" w:sz="6" w:space="0" w:color="auto"/>
+              <w:left w:val="single" w:sz="6" w:space="0" w:color="auto"/>
+              <w:bottom w:val="single" w:sz="6" w:space="0" w:color="auto"/>
+              <w:right w:val="single" w:sz="6" w:space="0" w:color="auto"/>
+            </w:tcBorders>
+            <w:tcMar>
+              <w:top w:w="240" w:type="dxa"/>
+              <w:left w:w="0" w:type="dxa"/>
+              <w:bottom w:w="240" w:type="dxa"/>
+              <w:right w:w="180" w:type="dxa"/>
+            </w:tcMar>
+            <w:vAlign w:val="center"/>
+            <w:hideMark/>
+          </w:tcPr>
+          <w:p>
+            <w:pPr>
+              <w:rPr>
+                <w:b/>
+                <w:bCs/>
+              </w:rPr>
+            </w:pPr>
+            <w:r>
+              <w:rPr>
+                <w:b/>
+                <w:bCs/>
+              </w:rPr>
+              <w:t>$H_1$</w:t>
+            </w:r>
+          </w:p>
+        </w:tc>
+        <w:tc>
+          <w:tcPr>
+            <w:tcW w:w="0" w:type="auto"/>
+            <w:tcBorders>
+              <w:top w:val="single" w:sz="6" w:space="0" w:color="auto"/>
+              <w:left w:val="single" w:sz="6" w:space="0" w:color="auto"/>
+              <w:bottom w:val="single" w:sz="6" w:space="0" w:color="auto"/>
+              <w:right w:val="single" w:sz="6" w:space="0" w:color="auto"/>
+            </w:tcBorders>
+            <w:tcMar>
+              <w:top w:w="240" w:type="dxa"/>
+              <w:left w:w="0" w:type="dxa"/>
+              <w:bottom w:w="240" w:type="dxa"/>
+              <w:right w:w="180" w:type="dxa"/>
+            </w:tcMar>
+            <w:vAlign w:val="center"/>
+            <w:hideMark/>
+          </w:tcPr>
+          <w:p>
+            <w:pPr>
+              <w:rPr>
+                <w:b/>
+                <w:bCs/>
+              </w:rPr>
+            </w:pPr>
+            <w:r>
+              <w:rPr>
+                <w:b/>
+                <w:bCs/>
+              </w:rPr>
+              <w:t>V</w:t>
+            </w:r>
+          </w:p>
+        </w:tc>
+        <w:tc>
+          <w:tcPr>
+            <w:tcW w:w="0" w:type="auto"/>
+            <w:tcBorders>
+              <w:top w:val="single" w:sz="6" w:space="0" w:color="auto"/>
+              <w:left w:val="single" w:sz="6" w:space="0" w:color="auto"/>
+              <w:bottom w:val="single" w:sz="6" w:space="0" w:color="auto"/>
+              <w:right w:val="single" w:sz="6" w:space="0" w:color="auto"/>
+            </w:tcBorders>
+            <w:tcMar>
+              <w:top w:w="240" w:type="dxa"/>
+              <w:left w:w="0" w:type="dxa"/>
+              <w:bottom w:w="240" w:type="dxa"/>
+              <w:right w:w="180" w:type="dxa"/>
+            </w:tcMar>
+            <w:vAlign w:val="center"/>
+            <w:hideMark/>
+          </w:tcPr>
+          <w:p>
+            <w:pPr>
+              <w:rPr>
+                <w:b/>
+                <w:bCs/>
+              </w:rPr>
+            </w:pPr>
+          </w:p>
+        </w:tc>
+        <w:tc>
+          <w:tcPr>
+            <w:tcW w:w="0" w:type="auto"/>
+            <w:tcBorders>
+              <w:top w:val="single" w:sz="6" w:space="0" w:color="auto"/>
+              <w:left w:val="single" w:sz="6" w:space="0" w:color="auto"/>
+              <w:bottom w:val="single" w:sz="6" w:space="0" w:color="auto"/>
+              <w:right w:val="single" w:sz="6" w:space="0" w:color="auto"/>
+            </w:tcBorders>
+            <w:tcMar>
+              <w:top w:w="240" w:type="dxa"/>
+              <w:left w:w="0" w:type="dxa"/>
+              <w:bottom w:w="240" w:type="dxa"/>
+              <w:right w:w="180" w:type="dxa"/>
+            </w:tcMar>
+            <w:vAlign w:val="center"/>
+            <w:hideMark/>
+          </w:tcPr>
+          <w:p>
+            <w:pPr>
+              <w:rPr>
+                <w:b/>
+                <w:bCs/>
+              </w:rPr>
+            </w:pPr>
+          </w:p>
+        </w:tc>
+        <w:tc>
+          <w:tcPr>
+            <w:tcW w:w="0" w:type="auto"/>
+            <w:tcBorders>
+              <w:top w:val="single" w:sz="6" w:space="0" w:color="auto"/>
+              <w:left w:val="single" w:sz="6" w:space="0" w:color="auto"/>
+              <w:bottom w:val="single" w:sz="6" w:space="0" w:color="auto"/>
+              <w:right w:val="single" w:sz="6" w:space="0" w:color="auto"/>
+            </w:tcBorders>
+            <w:tcMar>
+              <w:top w:w="240" w:type="dxa"/>
+              <w:left w:w="0" w:type="dxa"/>
+              <w:bottom w:w="240" w:type="dxa"/>
+              <w:right w:w="180" w:type="dxa"/>
+            </w:tcMar>
+            <w:vAlign w:val="center"/>
+            <w:hideMark/>
+          </w:tcPr>
+          <w:p>
+            <w:pPr>
+              <w:rPr>
+                <w:b/>
+                <w:bCs/>
+              </w:rPr>
+            </w:pPr>
+          </w:p>
+        </w:tc>
+        <w:tc>
+          <w:tcPr>
+            <w:tcW w:w="0" w:type="auto"/>
+            <w:tcBorders>
+              <w:top w:val="single" w:sz="6" w:space="0" w:color="auto"/>
+              <w:left w:val="single" w:sz="6" w:space="0" w:color="auto"/>
+              <w:bottom w:val="single" w:sz="6" w:space="0" w:color="auto"/>
+              <w:right w:val="single" w:sz="6" w:space="0" w:color="auto"/>
+            </w:tcBorders>
+            <w:tcMar>
+              <w:top w:w="240" w:type="dxa"/>
+              <w:left w:w="0" w:type="dxa"/>
+              <w:bottom w:w="240" w:type="dxa"/>
+              <w:right w:w="0" w:type="dxa"/>
+            </w:tcMar>
+            <w:vAlign w:val="center"/>
+            <w:hideMark/>
+          </w:tcPr>
+          <w:p>
+            <w:pPr>
+              <w:rPr>
+                <w:b/>
+                <w:bCs/>
+              </w:rPr>
+            </w:pPr>
+          </w:p>
+        </w:tc>
+      </w:tr>
+      <w:tr>
+        <w:trPr>
+          <w:tblCellSpacing w:w="15" w:type="dxa"/>
+        </w:trPr>
+        <w:tc>
+          <w:tcPr>
+            <w:tcW w:w="0" w:type="auto"/>
+            <w:tcBorders>
+              <w:top w:val="single" w:sz="6" w:space="0" w:color="auto"/>
+              <w:left w:val="single" w:sz="6" w:space="0" w:color="auto"/>
+              <w:bottom w:val="single" w:sz="6" w:space="0" w:color="auto"/>
+              <w:right w:val="single" w:sz="6" w:space="0" w:color="auto"/>
+            </w:tcBorders>
+            <w:tcMar>
+              <w:top w:w="240" w:type="dxa"/>
+              <w:left w:w="0" w:type="dxa"/>
+              <w:bottom w:w="240" w:type="dxa"/>
+              <w:right w:w="180" w:type="dxa"/>
+            </w:tcMar>
+            <w:vAlign w:val="center"/>
+            <w:hideMark/>
+          </w:tcPr>
+          <w:p>
+            <w:pPr>
+              <w:rPr>
+                <w:b/>
+                <w:bCs/>
+              </w:rPr>
+            </w:pPr>
+          </w:p>
+        </w:tc>
+        <w:tc>
+          <w:tcPr>
+            <w:tcW w:w="0" w:type="auto"/>
+            <w:tcBorders>
+              <w:top w:val="single" w:sz="6" w:space="0" w:color="auto"/>
+              <w:left w:val="single" w:sz="6" w:space="0" w:color="auto"/>
+              <w:bottom w:val="single" w:sz="6" w:space="0" w:color="auto"/>
+              <w:right w:val="single" w:sz="6" w:space="0" w:color="auto"/>
+            </w:tcBorders>
+            <w:tcMar>
+              <w:top w:w="240" w:type="dxa"/>
+              <w:left w:w="0" w:type="dxa"/>
+              <w:bottom w:w="240" w:type="dxa"/>
+              <w:right w:w="180" w:type="dxa"/>
+            </w:tcMar>
+            <w:vAlign w:val="center"/>
+            <w:hideMark/>
+          </w:tcPr>
+          <w:p>
+            <w:pPr>
+              <w:rPr>
+                <w:b/>
+                <w:bCs/>
+              </w:rPr>
+            </w:pPr>
+            <w:r>
+              <w:rPr>
+                <w:b/>
+                <w:bCs/>
+              </w:rPr>
+              <w:t>$H_2$</w:t>
+            </w:r>
+          </w:p>
+        </w:tc>
+        <w:tc>
+          <w:tcPr>
+            <w:tcW w:w="0" w:type="auto"/>
+            <w:tcBorders>
+              <w:top w:val="single" w:sz="6" w:space="0" w:color="auto"/>
+              <w:left w:val="single" w:sz="6" w:space="0" w:color="auto"/>
+              <w:bottom w:val="single" w:sz="6" w:space="0" w:color="auto"/>
+              <w:right w:val="single" w:sz="6" w:space="0" w:color="auto"/>
+            </w:tcBorders>
+            <w:tcMar>
+              <w:top w:w="240" w:type="dxa"/>
+              <w:left w:w="0" w:type="dxa"/>
+              <w:bottom w:w="240" w:type="dxa"/>
+              <w:right w:w="180" w:type="dxa"/>
+            </w:tcMar>
+            <w:vAlign w:val="center"/>
+            <w:hideMark/>
+          </w:tcPr>
+          <w:p>
+            <w:pPr>
+              <w:rPr>
+                <w:b/>
+                <w:bCs/>
+              </w:rPr>
+            </w:pPr>
+          </w:p>
+        </w:tc>
+        <w:tc>
+          <w:tcPr>
+            <w:tcW w:w="0" w:type="auto"/>
+            <w:tcBorders>
+              <w:top w:val="single" w:sz="6" w:space="0" w:color="auto"/>
+              <w:left w:val="single" w:sz="6" w:space="0" w:color="auto"/>
+              <w:bottom w:val="single" w:sz="6" w:space="0" w:color="auto"/>
+              <w:right w:val="single" w:sz="6" w:space="0" w:color="auto"/>
+            </w:tcBorders>
+            <w:tcMar>
+              <w:top w:w="240" w:type="dxa"/>
+              <w:left w:w="0" w:type="dxa"/>
+              <w:bottom w:w="240" w:type="dxa"/>
+              <w:right w:w="180" w:type="dxa"/>
+            </w:tcMar>
+            <w:vAlign w:val="center"/>
+            <w:hideMark/>
+          </w:tcPr>
+          <w:p>
+            <w:pPr>
+              <w:rPr>
+                <w:b/>
+                <w:bCs/>
+              </w:rPr>
+            </w:pPr>
+            <w:r>
+              <w:rPr>
+                <w:b/>
+                <w:bCs/>
+              </w:rPr>
+              <w:t>V</w:t>
+            </w:r>
+          </w:p>
+        </w:tc>
+        <w:tc>
+          <w:tcPr>
+            <w:tcW w:w="0" w:type="auto"/>
+            <w:tcBorders>
+              <w:top w:val="single" w:sz="6" w:space="0" w:color="auto"/>
+              <w:left w:val="single" w:sz="6" w:space="0" w:color="auto"/>
+              <w:bottom w:val="single" w:sz="6" w:space="0" w:color="auto"/>
+              <w:right w:val="single" w:sz="6" w:space="0" w:color="auto"/>
+            </w:tcBorders>
+            <w:tcMar>
+              <w:top w:w="240" w:type="dxa"/>
+              <w:left w:w="0" w:type="dxa"/>
+              <w:bottom w:w="240" w:type="dxa"/>
+              <w:right w:w="180" w:type="dxa"/>
+            </w:tcMar>
+            <w:vAlign w:val="center"/>
+            <w:hideMark/>
+          </w:tcPr>
+          <w:p>
+            <w:pPr>
+              <w:rPr>
+                <w:b/>
+                <w:bCs/>
+              </w:rPr>
+            </w:pPr>
+            <w:r>
+              <w:rPr>
+                <w:b/>
+                <w:bCs/>
+              </w:rPr>
+              <w:t>V</w:t>
+            </w:r>
+          </w:p>
+        </w:tc>
+        <w:tc>
+          <w:tcPr>
+            <w:tcW w:w="0" w:type="auto"/>
+            <w:tcBorders>
+              <w:top w:val="single" w:sz="6" w:space="0" w:color="auto"/>
+              <w:left w:val="single" w:sz="6" w:space="0" w:color="auto"/>
+              <w:bottom w:val="single" w:sz="6" w:space="0" w:color="auto"/>
+              <w:right w:val="single" w:sz="6" w:space="0" w:color="auto"/>
+            </w:tcBorders>
+            <w:tcMar>
+              <w:top w:w="240" w:type="dxa"/>
+              <w:left w:w="0" w:type="dxa"/>
+              <w:bottom w:w="240" w:type="dxa"/>
+              <w:right w:w="180" w:type="dxa"/>
+            </w:tcMar>
+            <w:vAlign w:val="center"/>
+            <w:hideMark/>
+          </w:tcPr>
+          <w:p>
+            <w:pPr>
+              <w:rPr>
+                <w:b/>
+                <w:bCs/>
+              </w:rPr>
+            </w:pPr>
+          </w:p>
+        </w:tc>
+        <w:tc>
+          <w:tcPr>
+            <w:tcW w:w="0" w:type="auto"/>
+            <w:tcBorders>
+              <w:top w:val="single" w:sz="6" w:space="0" w:color="auto"/>
+              <w:left w:val="single" w:sz="6" w:space="0" w:color="auto"/>
+              <w:bottom w:val="single" w:sz="6" w:space="0" w:color="auto"/>
+              <w:right w:val="single" w:sz="6" w:space="0" w:color="auto"/>
+            </w:tcBorders>
+            <w:tcMar>
+              <w:top w:w="240" w:type="dxa"/>
+              <w:left w:w="0" w:type="dxa"/>
+              <w:bottom w:w="240" w:type="dxa"/>
+              <w:right w:w="0" w:type="dxa"/>
+            </w:tcMar>
+            <w:vAlign w:val="center"/>
+            <w:hideMark/>
+          </w:tcPr>
+          <w:p>
+            <w:pPr>
+              <w:rPr>
+                <w:b/>
+                <w:bCs/>
+              </w:rPr>
+            </w:pPr>
+            <w:r>
+              <w:rPr>
+                <w:b/>
+                <w:bCs/>
+              </w:rPr>
+              <w:t>V</w:t>
+            </w:r>
+          </w:p>
+        </w:tc>
+      </w:tr>
+      <w:tr>
+        <w:trPr>
+          <w:tblCellSpacing w:w="15" w:type="dxa"/>
+        </w:trPr>
+        <w:tc>
+          <w:tcPr>
+            <w:tcW w:w="0" w:type="auto"/>
+            <w:tcBorders>
+              <w:top w:val="single" w:sz="6" w:space="0" w:color="auto"/>
+              <w:left w:val="single" w:sz="6" w:space="0" w:color="auto"/>
+              <w:bottom w:val="single" w:sz="6" w:space="0" w:color="auto"/>
+              <w:right w:val="single" w:sz="6" w:space="0" w:color="auto"/>
+            </w:tcBorders>
+            <w:tcMar>
+              <w:top w:w="240" w:type="dxa"/>
+              <w:left w:w="0" w:type="dxa"/>
+              <w:bottom w:w="240" w:type="dxa"/>
+              <w:right w:w="180" w:type="dxa"/>
+            </w:tcMar>
+            <w:vAlign w:val="center"/>
+            <w:hideMark/>
+          </w:tcPr>
+          <w:p>
+            <w:pPr>
+              <w:rPr>
+                <w:b/>
+                <w:bCs/>
+              </w:rPr>
+            </w:pPr>
+          </w:p>
+        </w:tc>
+        <w:tc>
+          <w:tcPr>
+            <w:tcW w:w="0" w:type="auto"/>
+            <w:tcBorders>
+              <w:top w:val="single" w:sz="6" w:space="0" w:color="auto"/>
+              <w:left w:val="single" w:sz="6" w:space="0" w:color="auto"/>
+              <w:bottom w:val="single" w:sz="6" w:space="0" w:color="auto"/>
+              <w:right w:val="single" w:sz="6" w:space="0" w:color="auto"/>
+            </w:tcBorders>
+            <w:tcMar>
+              <w:top w:w="240" w:type="dxa"/>
+              <w:left w:w="0" w:type="dxa"/>
+              <w:bottom w:w="240" w:type="dxa"/>
+              <w:right w:w="180" w:type="dxa"/>
+            </w:tcMar>
+            <w:vAlign w:val="center"/>
+            <w:hideMark/>
+          </w:tcPr>
+          <w:p>
+            <w:pPr>
+              <w:rPr>
+                <w:b/>
+                <w:bCs/>
+              </w:rPr>
+            </w:pPr>
+            <w:r>
+              <w:rPr>
+                <w:b/>
+                <w:bCs/>
+              </w:rPr>
+              <w:t>$H_3$</w:t>
+            </w:r>
+          </w:p>
+        </w:tc>
+        <w:tc>
+          <w:tcPr>
+            <w:tcW w:w="0" w:type="auto"/>
+            <w:tcBorders>
+              <w:top w:val="single" w:sz="6" w:space="0" w:color="auto"/>
+              <w:left w:val="single" w:sz="6" w:space="0" w:color="auto"/>
+              <w:bottom w:val="single" w:sz="6" w:space="0" w:color="auto"/>
+              <w:right w:val="single" w:sz="6" w:space="0" w:color="auto"/>
+            </w:tcBorders>
+            <w:tcMar>
+              <w:top w:w="240" w:type="dxa"/>
+              <w:left w:w="0" w:type="dxa"/>
+              <w:bottom w:w="240" w:type="dxa"/>
+              <w:right w:w="180" w:type="dxa"/>
+            </w:tcMar>
+            <w:vAlign w:val="center"/>
+            <w:hideMark/>
+          </w:tcPr>
+          <w:p>
+            <w:pPr>
+              <w:rPr>
+                <w:b/>
+                <w:bCs/>
+              </w:rPr>
+            </w:pPr>
+          </w:p>
+        </w:tc>
+        <w:tc>
+          <w:tcPr>
+            <w:tcW w:w="0" w:type="auto"/>
+            <w:tcBorders>
+              <w:top w:val="single" w:sz="6" w:space="0" w:color="auto"/>
+              <w:left w:val="single" w:sz="6" w:space="0" w:color="auto"/>
+              <w:bottom w:val="single" w:sz="6" w:space="0" w:color="auto"/>
+              <w:right w:val="single" w:sz="6" w:space="0" w:color="auto"/>
+            </w:tcBorders>
+            <w:tcMar>
+              <w:top w:w="240" w:type="dxa"/>
+              <w:left w:w="0" w:type="dxa"/>
+              <w:bottom w:w="240" w:type="dxa"/>
+              <w:right w:w="180" w:type="dxa"/>
+            </w:tcMar>
+            <w:vAlign w:val="center"/>
+            <w:hideMark/>
+          </w:tcPr>
+          <w:p>
+            <w:pPr>
+              <w:rPr>
+                <w:b/>
+                <w:bCs/>
+              </w:rPr>
+            </w:pPr>
+          </w:p>
+        </w:tc>
+        <w:tc>
+          <w:tcPr>
+            <w:tcW w:w="0" w:type="auto"/>
+            <w:tcBorders>
+              <w:top w:val="single" w:sz="6" w:space="0" w:color="auto"/>
+              <w:left w:val="single" w:sz="6" w:space="0" w:color="auto"/>
+              <w:bottom w:val="single" w:sz="6" w:space="0" w:color="auto"/>
+              <w:right w:val="single" w:sz="6" w:space="0" w:color="auto"/>
+            </w:tcBorders>
+            <w:tcMar>
+              <w:top w:w="240" w:type="dxa"/>
+              <w:left w:w="0" w:type="dxa"/>
+              <w:bottom w:w="240" w:type="dxa"/>
+              <w:right w:w="180" w:type="dxa"/>
+            </w:tcMar>
+            <w:vAlign w:val="center"/>
+            <w:hideMark/>
+          </w:tcPr>
+          <w:p>
+            <w:pPr>
+              <w:rPr>
+                <w:b/>
+                <w:bCs/>
+              </w:rPr>
+            </w:pPr>
+          </w:p>
+        </w:tc>
+        <w:tc>
+          <w:tcPr>
+            <w:tcW w:w="0" w:type="auto"/>
+            <w:tcBorders>
+              <w:top w:val="single" w:sz="6" w:space="0" w:color="auto"/>
+              <w:left w:val="single" w:sz="6" w:space="0" w:color="auto"/>
+              <w:bottom w:val="single" w:sz="6" w:space="0" w:color="auto"/>
+              <w:right w:val="single" w:sz="6" w:space="0" w:color="auto"/>
+            </w:tcBorders>
+            <w:tcMar>
+              <w:top w:w="240" w:type="dxa"/>
+              <w:left w:w="0" w:type="dxa"/>
+              <w:bottom w:w="240" w:type="dxa"/>
+              <w:right w:w="180" w:type="dxa"/>
+            </w:tcMar>
+            <w:vAlign w:val="center"/>
+            <w:hideMark/>
+          </w:tcPr>
+          <w:p>
+            <w:pPr>
+              <w:rPr>
+                <w:b/>
+                <w:bCs/>
+              </w:rPr>
+            </w:pPr>
+            <w:r>
+              <w:rPr>
+                <w:b/>
+                <w:bCs/>
+              </w:rPr>
+              <w:t>V</w:t>
+            </w:r>
+          </w:p>
+        </w:tc>
+        <w:tc>
+          <w:tcPr>
+            <w:tcW w:w="0" w:type="auto"/>
+            <w:tcBorders>
+              <w:top w:val="single" w:sz="6" w:space="0" w:color="auto"/>
+              <w:left w:val="single" w:sz="6" w:space="0" w:color="auto"/>
+              <w:bottom w:val="single" w:sz="6" w:space="0" w:color="auto"/>
+              <w:right w:val="single" w:sz="6" w:space="0" w:color="auto"/>
+            </w:tcBorders>
+            <w:tcMar>
+              <w:top w:w="240" w:type="dxa"/>
+              <w:left w:w="0" w:type="dxa"/>
+              <w:bottom w:w="240" w:type="dxa"/>
+              <w:right w:w="0" w:type="dxa"/>
+            </w:tcMar>
+            <w:vAlign w:val="center"/>
+            <w:hideMark/>
+          </w:tcPr>
+          <w:p>
+            <w:pPr>
+              <w:rPr>
+                <w:b/>
+                <w:bCs/>
+              </w:rPr>
+            </w:pPr>
+          </w:p>
+        </w:tc>
+      </w:tr>
+      <w:tr>
+        <w:trPr>
+          <w:tblCellSpacing w:w="15" w:type="dxa"/>
+        </w:trPr>
+        <w:tc>
+          <w:tcPr>
+            <w:tcW w:w="0" w:type="auto"/>
+            <w:tcBorders>
+              <w:top w:val="single" w:sz="6" w:space="0" w:color="auto"/>
+              <w:left w:val="single" w:sz="6" w:space="0" w:color="auto"/>
+              <w:bottom w:val="single" w:sz="6" w:space="0" w:color="auto"/>
+              <w:right w:val="single" w:sz="6" w:space="0" w:color="auto"/>
+            </w:tcBorders>
+            <w:tcMar>
+              <w:top w:w="240" w:type="dxa"/>
+              <w:left w:w="0" w:type="dxa"/>
+              <w:bottom w:w="240" w:type="dxa"/>
+              <w:right w:w="180" w:type="dxa"/>
+            </w:tcMar>
+            <w:vAlign w:val="center"/>
+            <w:hideMark/>
+          </w:tcPr>
+          <w:p>
+            <w:pPr>
+              <w:rPr>
+                <w:b/>
+                <w:bCs/>
+              </w:rPr>
+            </w:pPr>
+            <w:r>
+              <w:rPr>
+                <w:b/>
+                <w:bCs/>
+              </w:rPr>
+              <w:t>Fruto</w:t>
+            </w:r>
+          </w:p>
+        </w:tc>
+        <w:tc>
+          <w:tcPr>
+            <w:tcW w:w="0" w:type="auto"/>
+            <w:tcBorders>
+              <w:top w:val="single" w:sz="6" w:space="0" w:color="auto"/>
+              <w:left w:val="single" w:sz="6" w:space="0" w:color="auto"/>
+              <w:bottom w:val="single" w:sz="6" w:space="0" w:color="auto"/>
+              <w:right w:val="single" w:sz="6" w:space="0" w:color="auto"/>
+            </w:tcBorders>
+            <w:tcMar>
+              <w:top w:w="240" w:type="dxa"/>
+              <w:left w:w="0" w:type="dxa"/>
+              <w:bottom w:w="240" w:type="dxa"/>
+              <w:right w:w="180" w:type="dxa"/>
+            </w:tcMar>
+            <w:vAlign w:val="center"/>
+            <w:hideMark/>
+          </w:tcPr>
+          <w:p>
+            <w:pPr>
+              <w:rPr>
+                <w:b/>
+                <w:bCs/>
+              </w:rPr>
+            </w:pPr>
+            <w:r>
+              <w:rPr>
+                <w:b/>
+                <w:bCs/>
+              </w:rPr>
+              <w:t>$F_1$</w:t>
+            </w:r>
+          </w:p>
+        </w:tc>
+        <w:tc>
+          <w:tcPr>
+            <w:tcW w:w="0" w:type="auto"/>
+            <w:tcBorders>
+              <w:top w:val="single" w:sz="6" w:space="0" w:color="auto"/>
+              <w:left w:val="single" w:sz="6" w:space="0" w:color="auto"/>
+              <w:bottom w:val="single" w:sz="6" w:space="0" w:color="auto"/>
+              <w:right w:val="single" w:sz="6" w:space="0" w:color="auto"/>
+            </w:tcBorders>
+            <w:tcMar>
+              <w:top w:w="240" w:type="dxa"/>
+              <w:left w:w="0" w:type="dxa"/>
+              <w:bottom w:w="240" w:type="dxa"/>
+              <w:right w:w="180" w:type="dxa"/>
+            </w:tcMar>
+            <w:vAlign w:val="center"/>
+            <w:hideMark/>
+          </w:tcPr>
+          <w:p>
+            <w:pPr>
+              <w:rPr>
+                <w:b/>
+                <w:bCs/>
+              </w:rPr>
+            </w:pPr>
+            <w:r>
+              <w:rPr>
+                <w:b/>
+                <w:bCs/>
+              </w:rPr>
+              <w:t>V</w:t>
+            </w:r>
+          </w:p>
+        </w:tc>
+        <w:tc>
+          <w:tcPr>
+            <w:tcW w:w="0" w:type="auto"/>
+            <w:tcBorders>
+              <w:top w:val="single" w:sz="6" w:space="0" w:color="auto"/>
+              <w:left w:val="single" w:sz="6" w:space="0" w:color="auto"/>
+              <w:bottom w:val="single" w:sz="6" w:space="0" w:color="auto"/>
+              <w:right w:val="single" w:sz="6" w:space="0" w:color="auto"/>
+            </w:tcBorders>
+            <w:tcMar>
+              <w:top w:w="240" w:type="dxa"/>
+              <w:left w:w="0" w:type="dxa"/>
+              <w:bottom w:w="240" w:type="dxa"/>
+              <w:right w:w="180" w:type="dxa"/>
+            </w:tcMar>
+            <w:vAlign w:val="center"/>
+            <w:hideMark/>
+          </w:tcPr>
+          <w:p>
+            <w:pPr>
+              <w:rPr>
+                <w:b/>
+                <w:bCs/>
+              </w:rPr>
+            </w:pPr>
+          </w:p>
+        </w:tc>
+        <w:tc>
+          <w:tcPr>
+            <w:tcW w:w="0" w:type="auto"/>
+            <w:tcBorders>
+              <w:top w:val="single" w:sz="6" w:space="0" w:color="auto"/>
+              <w:left w:val="single" w:sz="6" w:space="0" w:color="auto"/>
+              <w:bottom w:val="single" w:sz="6" w:space="0" w:color="auto"/>
+              <w:right w:val="single" w:sz="6" w:space="0" w:color="auto"/>
+            </w:tcBorders>
+            <w:tcMar>
+              <w:top w:w="240" w:type="dxa"/>
+              <w:left w:w="0" w:type="dxa"/>
+              <w:bottom w:w="240" w:type="dxa"/>
+              <w:right w:w="180" w:type="dxa"/>
+            </w:tcMar>
+            <w:vAlign w:val="center"/>
+            <w:hideMark/>
+          </w:tcPr>
+          <w:p>
+            <w:pPr>
+              <w:rPr>
+                <w:b/>
+                <w:bCs/>
+              </w:rPr>
+            </w:pPr>
+            <w:r>
+              <w:rPr>
+                <w:b/>
+                <w:bCs/>
+              </w:rPr>
+              <w:t>V</w:t>
+            </w:r>
+          </w:p>
+        </w:tc>
+        <w:tc>
+          <w:tcPr>
+            <w:tcW w:w="0" w:type="auto"/>
+            <w:tcBorders>
+              <w:top w:val="single" w:sz="6" w:space="0" w:color="auto"/>
+              <w:left w:val="single" w:sz="6" w:space="0" w:color="auto"/>
+              <w:bottom w:val="single" w:sz="6" w:space="0" w:color="auto"/>
+              <w:right w:val="single" w:sz="6" w:space="0" w:color="auto"/>
+            </w:tcBorders>
+            <w:tcMar>
+              <w:top w:w="240" w:type="dxa"/>
+              <w:left w:w="0" w:type="dxa"/>
+              <w:bottom w:w="240" w:type="dxa"/>
+              <w:right w:w="180" w:type="dxa"/>
+            </w:tcMar>
+            <w:vAlign w:val="center"/>
+            <w:hideMark/>
+          </w:tcPr>
+          <w:p>
+            <w:pPr>
+              <w:rPr>
+                <w:b/>
+                <w:bCs/>
+              </w:rPr>
+            </w:pPr>
+            <w:r>
+              <w:rPr>
+                <w:b/>
+                <w:bCs/>
+              </w:rPr>
+              <w:t>V</w:t>
+            </w:r>
+          </w:p>
+        </w:tc>
+        <w:tc>
+          <w:tcPr>
+            <w:tcW w:w="0" w:type="auto"/>
+            <w:tcBorders>
+              <w:top w:val="single" w:sz="6" w:space="0" w:color="auto"/>
+              <w:left w:val="single" w:sz="6" w:space="0" w:color="auto"/>
+              <w:bottom w:val="single" w:sz="6" w:space="0" w:color="auto"/>
+              <w:right w:val="single" w:sz="6" w:space="0" w:color="auto"/>
+            </w:tcBorders>
+            <w:tcMar>
+              <w:top w:w="240" w:type="dxa"/>
+              <w:left w:w="0" w:type="dxa"/>
+              <w:bottom w:w="240" w:type="dxa"/>
+              <w:right w:w="0" w:type="dxa"/>
+            </w:tcMar>
+            <w:vAlign w:val="center"/>
+            <w:hideMark/>
+          </w:tcPr>
+          <w:p>
+            <w:pPr>
+              <w:rPr>
+                <w:b/>
+                <w:bCs/>
+              </w:rPr>
+            </w:pPr>
+          </w:p>
+        </w:tc>
+      </w:tr>
+      <w:tr>
+        <w:trPr>
+          <w:tblCellSpacing w:w="15" w:type="dxa"/>
+        </w:trPr>
+        <w:tc>
+          <w:tcPr>
+            <w:tcW w:w="0" w:type="auto"/>
+            <w:tcBorders>
+              <w:top w:val="single" w:sz="6" w:space="0" w:color="auto"/>
+              <w:left w:val="single" w:sz="6" w:space="0" w:color="auto"/>
+              <w:bottom w:val="single" w:sz="6" w:space="0" w:color="auto"/>
+              <w:right w:val="single" w:sz="6" w:space="0" w:color="auto"/>
+            </w:tcBorders>
+            <w:tcMar>
+              <w:top w:w="240" w:type="dxa"/>
+              <w:left w:w="0" w:type="dxa"/>
+              <w:bottom w:w="240" w:type="dxa"/>
+              <w:right w:w="180" w:type="dxa"/>
+            </w:tcMar>
+            <w:vAlign w:val="center"/>
+            <w:hideMark/>
+          </w:tcPr>
+          <w:p>
+            <w:pPr>
+              <w:rPr>
+                <w:b/>
+                <w:bCs/>
+              </w:rPr>
+            </w:pPr>
+          </w:p>
+        </w:tc>
+        <w:tc>
+          <w:tcPr>
+            <w:tcW w:w="0" w:type="auto"/>
+            <w:tcBorders>
+              <w:top w:val="single" w:sz="6" w:space="0" w:color="auto"/>
+              <w:left w:val="single" w:sz="6" w:space="0" w:color="auto"/>
+              <w:bottom w:val="single" w:sz="6" w:space="0" w:color="auto"/>
+              <w:right w:val="single" w:sz="6" w:space="0" w:color="auto"/>
+            </w:tcBorders>
+            <w:tcMar>
+              <w:top w:w="240" w:type="dxa"/>
+              <w:left w:w="0" w:type="dxa"/>
+              <w:bottom w:w="240" w:type="dxa"/>
+              <w:right w:w="180" w:type="dxa"/>
+            </w:tcMar>
+            <w:vAlign w:val="center"/>
+            <w:hideMark/>
+          </w:tcPr>
+          <w:p>
+            <w:pPr>
+              <w:rPr>
+                <w:b/>
+                <w:bCs/>
+              </w:rPr>
+            </w:pPr>
+            <w:r>
+              <w:rPr>
+                <w:b/>
+                <w:bCs/>
+              </w:rPr>
+              <w:t>$F_2$</w:t>
+            </w:r>
+          </w:p>
+        </w:tc>
+        <w:tc>
+          <w:tcPr>
+            <w:tcW w:w="0" w:type="auto"/>
+            <w:tcBorders>
+              <w:top w:val="single" w:sz="6" w:space="0" w:color="auto"/>
+              <w:left w:val="single" w:sz="6" w:space="0" w:color="auto"/>
+              <w:bottom w:val="single" w:sz="6" w:space="0" w:color="auto"/>
+              <w:right w:val="single" w:sz="6" w:space="0" w:color="auto"/>
+            </w:tcBorders>
+            <w:tcMar>
+              <w:top w:w="240" w:type="dxa"/>
+              <w:left w:w="0" w:type="dxa"/>
+              <w:bottom w:w="240" w:type="dxa"/>
+              <w:right w:w="180" w:type="dxa"/>
+            </w:tcMar>
+            <w:vAlign w:val="center"/>
+            <w:hideMark/>
+          </w:tcPr>
+          <w:p>
+            <w:pPr>
+              <w:rPr>
+                <w:b/>
+                <w:bCs/>
+              </w:rPr>
+            </w:pPr>
+            <w:r>
+              <w:rPr>
+                <w:b/>
+                <w:bCs/>
+              </w:rPr>
+              <w:t>V</w:t>
+            </w:r>
+          </w:p>
+        </w:tc>
+        <w:tc>
+          <w:tcPr>
+            <w:tcW w:w="0" w:type="auto"/>
+            <w:tcBorders>
+              <w:top w:val="single" w:sz="6" w:space="0" w:color="auto"/>
+              <w:left w:val="single" w:sz="6" w:space="0" w:color="auto"/>
+              <w:bottom w:val="single" w:sz="6" w:space="0" w:color="auto"/>
+              <w:right w:val="single" w:sz="6" w:space="0" w:color="auto"/>
+            </w:tcBorders>
+            <w:tcMar>
+              <w:top w:w="240" w:type="dxa"/>
+              <w:left w:w="0" w:type="dxa"/>
+              <w:bottom w:w="240" w:type="dxa"/>
+              <w:right w:w="180" w:type="dxa"/>
+            </w:tcMar>
+            <w:vAlign w:val="center"/>
+            <w:hideMark/>
+          </w:tcPr>
+          <w:p>
+            <w:pPr>
+              <w:rPr>
+                <w:b/>
+                <w:bCs/>
+              </w:rPr>
+            </w:pPr>
+          </w:p>
+        </w:tc>
+        <w:tc>
+          <w:tcPr>
+            <w:tcW w:w="0" w:type="auto"/>
+            <w:tcBorders>
+              <w:top w:val="single" w:sz="6" w:space="0" w:color="auto"/>
+              <w:left w:val="single" w:sz="6" w:space="0" w:color="auto"/>
+              <w:bottom w:val="single" w:sz="6" w:space="0" w:color="auto"/>
+              <w:right w:val="single" w:sz="6" w:space="0" w:color="auto"/>
+            </w:tcBorders>
+            <w:tcMar>
+              <w:top w:w="240" w:type="dxa"/>
+              <w:left w:w="0" w:type="dxa"/>
+              <w:bottom w:w="240" w:type="dxa"/>
+              <w:right w:w="180" w:type="dxa"/>
+            </w:tcMar>
+            <w:vAlign w:val="center"/>
+            <w:hideMark/>
+          </w:tcPr>
+          <w:p>
+            <w:pPr>
+              <w:rPr>
+                <w:b/>
+                <w:bCs/>
+              </w:rPr>
+            </w:pPr>
+            <w:r>
+              <w:rPr>
+                <w:b/>
+                <w:bCs/>
+              </w:rPr>
+              <w:t>V</w:t>
+            </w:r>
+          </w:p>
+        </w:tc>
+        <w:tc>
+          <w:tcPr>
+            <w:tcW w:w="0" w:type="auto"/>
+            <w:tcBorders>
+              <w:top w:val="single" w:sz="6" w:space="0" w:color="auto"/>
+              <w:left w:val="single" w:sz="6" w:space="0" w:color="auto"/>
+              <w:bottom w:val="single" w:sz="6" w:space="0" w:color="auto"/>
+              <w:right w:val="single" w:sz="6" w:space="0" w:color="auto"/>
+            </w:tcBorders>
+            <w:tcMar>
+              <w:top w:w="240" w:type="dxa"/>
+              <w:left w:w="0" w:type="dxa"/>
+              <w:bottom w:w="240" w:type="dxa"/>
+              <w:right w:w="180" w:type="dxa"/>
+            </w:tcMar>
+            <w:vAlign w:val="center"/>
+            <w:hideMark/>
+          </w:tcPr>
+          <w:p>
+            <w:pPr>
+              <w:rPr>
+                <w:b/>
+                <w:bCs/>
+              </w:rPr>
+            </w:pPr>
+            <w:r>
+              <w:rPr>
+                <w:b/>
+                <w:bCs/>
+              </w:rPr>
+              <w:t>V</w:t>
+            </w:r>
+          </w:p>
+        </w:tc>
+        <w:tc>
+          <w:tcPr>
+            <w:tcW w:w="0" w:type="auto"/>
+            <w:tcBorders>
+              <w:top w:val="single" w:sz="6" w:space="0" w:color="auto"/>
+              <w:left w:val="single" w:sz="6" w:space="0" w:color="auto"/>
+              <w:bottom w:val="single" w:sz="6" w:space="0" w:color="auto"/>
+              <w:right w:val="single" w:sz="6" w:space="0" w:color="auto"/>
+            </w:tcBorders>
+            <w:tcMar>
+              <w:top w:w="240" w:type="dxa"/>
+              <w:left w:w="0" w:type="dxa"/>
+              <w:bottom w:w="240" w:type="dxa"/>
+              <w:right w:w="0" w:type="dxa"/>
+            </w:tcMar>
+            <w:vAlign w:val="center"/>
+            <w:hideMark/>
+          </w:tcPr>
+          <w:p>
+            <w:pPr>
+              <w:rPr>
+                <w:b/>
+                <w:bCs/>
+              </w:rPr>
+            </w:pPr>
+          </w:p>
+        </w:tc>
+      </w:tr>
+    </w:tbl>
+    <w:p>
+      <w:pPr>
+        <w:rPr>
+          <w:b/>
+          <w:bCs/>
+        </w:rPr>
+      </w:pPr>
+      <w:r>
+        <w:rPr>
+          <w:b/>
+          <w:bCs/>
+        </w:rPr>
+        <w:t>Preguntas</w:t>
+      </w:r>
+    </w:p>
+    <w:p>
+      <w:pPr>
+        <w:rPr>
+          <w:b/>
+          <w:bCs/>
+        </w:rPr>
+      </w:pPr>
+      <w:r>
+        <w:rPr>
+          <w:b/>
+          <w:bCs/>
+        </w:rPr>
+        <w:t>2.9. Si se quiere investigar la incidencia determinante de las 3 sustancias que están presentes en las hojas, entonces, la investigación debe seleccionar las especies:</w:t>
+      </w:r>
+    </w:p>
+    <w:p>
+      <w:pPr>
+        <w:rPr>
+          <w:b/>
+          <w:bCs/>
+        </w:rPr>
+      </w:pPr>
+      <w:r>
+        <w:rPr>
+          <w:b/>
+          <w:bCs/>
+        </w:rPr>
+        <w:t>(a) $E_2, E_3, E_5$ | (b) $E_1, E_3, E_4$ | (c) $E_1, E_3, E_5$ | (d) $E_3, E_4, E_5$</w:t>
+      </w:r>
+    </w:p>
+    <w:p>
+      <w:pPr>
+        <w:rPr>
+          <w:b/>
+          <w:bCs/>
+        </w:rPr>
+      </w:pPr>
+      <w:r>
+        <w:rPr>
+          <w:b/>
+          <w:bCs/>
+        </w:rPr>
+        <w:t>2.10. Si se quiere investigar la incidencia determinante de las 2 sustancias presentes en las raíces, entonces la investigación debe seleccionar las especies:</w:t>
+      </w:r>
+    </w:p>
+    <w:p>
+      <w:pPr>
+        <w:rPr>
+          <w:b/>
+          <w:bCs/>
+        </w:rPr>
+      </w:pPr>
+      <w:r>
+        <w:rPr>
+          <w:b/>
+          <w:bCs/>
+        </w:rPr>
+        <w:t>(a) $E_2$ y $E_5$ | (b) $E_2$ y $E_3$ | (c) $E_3$ y $E_4$ | (d) $E_3$ y $E_5$</w:t>
+      </w:r>
+    </w:p>
+    <w:p>
+      <w:pPr>
+        <w:rPr>
+          <w:b/>
+          <w:bCs/>
+        </w:rPr>
+      </w:pPr>
+      <w:r>
+        <w:rPr>
+          <w:b/>
+          <w:bCs/>
+        </w:rPr>
+        <w:pict w14:anchorId="42365214">
+          <v:rect id="_x0000_i1086" style="width:0;height:1.5pt" o:hralign="center" o:hrstd="t" o:hrnoshade="t" o:hr="t" fillcolor="gray" stroked="f"/>
+        </w:pict>
+      </w:r>
+    </w:p>
+    <w:p>
+      <w:pPr>
+        <w:rPr>
+          <w:b/>
+          <w:bCs/>
+        </w:rPr>
+      </w:pPr>
+      <w:r>
+        <w:rPr>
+          <w:b/>
+          <w:bCs/>
+        </w:rPr>
+        <w:t>2. Estrategia de Solución: "Filtrado por Cobertura Total"</w:t>
+      </w:r>
+    </w:p>
+    <w:p>
+      <w:pPr>
+        <w:rPr>
+          <w:b/>
+          <w:bCs/>
+        </w:rPr>
+      </w:pPr>
+      <w:r>
+        <w:rPr>
+          <w:b/>
+          <w:bCs/>
+        </w:rPr>
+        <w:t>Para resolver esto en menos de un minuto, el estudiante debe aplicar la Regla de la Unión Necesaria: No busca una especie que tenga todo, sino el grupo mínimo de especies que, juntas, contengan todas las sustancias requeridas.</w:t>
+      </w:r>
+    </w:p>
+    <w:p>
+      <w:pPr>
+        <w:rPr>
+          <w:b/>
+          <w:bCs/>
+        </w:rPr>
+      </w:pPr>
+      <w:r>
+        <w:rPr>
+          <w:b/>
+          <w:bCs/>
+        </w:rPr>
+        <w:t>Resolución 2.9 (Hojas):</w:t>
+      </w:r>
+    </w:p>
+    <w:p>
+      <w:pPr>
+        <w:numPr>
+          <w:ilvl w:val="0"/>
+          <w:numId w:val="6"/>
+        </w:numPr>
+        <w:rPr>
+          <w:b/>
+          <w:bCs/>
+        </w:rPr>
+      </w:pPr>
+      <w:r>
+        <w:rPr>
+          <w:b/>
+          <w:bCs/>
+        </w:rPr>
+        <w:t>Identificar objetivo: Sustancias de la hoja ($H_1, H_2, H_3$).</w:t>
+      </w:r>
+    </w:p>
+    <w:p>
+      <w:pPr>
+        <w:numPr>
+          <w:ilvl w:val="0"/>
+          <w:numId w:val="6"/>
+        </w:numPr>
+        <w:rPr>
+          <w:b/>
+          <w:bCs/>
+        </w:rPr>
+      </w:pPr>
+      <w:r>
+        <w:rPr>
+          <w:b/>
+          <w:bCs/>
+        </w:rPr>
+        <w:t>Rastreo rápido:</w:t>
+      </w:r>
+    </w:p>
+    <w:p>
+      <w:pPr>
+        <w:numPr>
+          <w:ilvl w:val="1"/>
+          <w:numId w:val="6"/>
+        </w:numPr>
+        <w:rPr>
+          <w:b/>
+          <w:bCs/>
+        </w:rPr>
+      </w:pPr>
+      <w:r>
+        <w:rPr>
+          <w:b/>
+          <w:bCs/>
+        </w:rPr>
+        <w:t>$H_1$ solo está en $E_1$. (Obligatorio elegir $E_1$).</w:t>
+      </w:r>
+    </w:p>
+    <w:p>
+      <w:pPr>
+        <w:numPr>
+          <w:ilvl w:val="1"/>
+          <w:numId w:val="6"/>
+        </w:numPr>
+        <w:rPr>
+          <w:b/>
+          <w:bCs/>
+        </w:rPr>
+      </w:pPr>
+      <w:r>
+        <w:rPr>
+          <w:b/>
+          <w:bCs/>
+        </w:rPr>
+        <w:t>$H_3$ solo está en $E_4$. (Obligatorio elegir $E_4$).</w:t>
+      </w:r>
+    </w:p>
+    <w:p>
+      <w:pPr>
+        <w:numPr>
+          <w:ilvl w:val="0"/>
+          <w:numId w:val="6"/>
+        </w:numPr>
+        <w:rPr>
+          <w:b/>
+          <w:bCs/>
+        </w:rPr>
+      </w:pPr>
+      <w:r>
+        <w:rPr>
+          <w:b/>
+          <w:bCs/>
+        </w:rPr>
+        <w:t>Conclusión: La única opción que contiene a $E_1$ y $E_4$ es la (b).</w:t>
+      </w:r>
+    </w:p>
+    <w:p>
+      <w:pPr>
+        <w:rPr>
+          <w:b/>
+          <w:bCs/>
+        </w:rPr>
+      </w:pPr>
+      <w:r>
+        <w:rPr>
+          <w:b/>
+          <w:bCs/>
+          <w:i/>
+          <w:iCs/>
+        </w:rPr>
+        <w:t>Verificación:</w:t>
+      </w:r>
+      <w:r>
+        <w:rPr>
+          <w:b/>
+          <w:bCs/>
+        </w:rPr>
+        <w:t xml:space="preserve"> $E_1(H_1)$, $E_3(H_2)$, $E_4(H_3)$. Se cubren las tres.</w:t>
+      </w:r>
+    </w:p>
+    <w:p>
+      <w:pPr>
+        <w:rPr>
+          <w:b/>
+          <w:bCs/>
+        </w:rPr>
+      </w:pPr>
+      <w:r>
+        <w:rPr>
+          <w:b/>
+          <w:bCs/>
+        </w:rPr>
+        <w:t>Resolución 2.10 (Raíces):</w:t>
+      </w:r>
+    </w:p>
+    <w:p>
+      <w:pPr>
+        <w:numPr>
+          <w:ilvl w:val="0"/>
+          <w:numId w:val="7"/>
+        </w:numPr>
+        <w:rPr>
+          <w:b/>
+          <w:bCs/>
+        </w:rPr>
+      </w:pPr>
+      <w:r>
+        <w:rPr>
+          <w:b/>
+          <w:bCs/>
+        </w:rPr>
+        <w:t>Identificar objetivo: Sustancias de la raíz ($R_1, R_2$).</w:t>
+      </w:r>
+    </w:p>
+    <w:p>
+      <w:pPr>
+        <w:numPr>
+          <w:ilvl w:val="0"/>
+          <w:numId w:val="7"/>
+        </w:numPr>
+        <w:rPr>
+          <w:b/>
+          <w:bCs/>
+        </w:rPr>
+      </w:pPr>
+      <w:r>
+        <w:rPr>
+          <w:b/>
+          <w:bCs/>
+        </w:rPr>
+        <w:t>Rastreo rápido:</w:t>
+      </w:r>
+    </w:p>
+    <w:p>
+      <w:pPr>
+        <w:numPr>
+          <w:ilvl w:val="1"/>
+          <w:numId w:val="7"/>
+        </w:numPr>
+        <w:rPr>
+          <w:b/>
+          <w:bCs/>
+        </w:rPr>
+      </w:pPr>
+      <w:r>
+        <w:rPr>
+          <w:b/>
+          <w:bCs/>
+        </w:rPr>
+        <w:lastRenderedPageBreak/>
+        <w:t>Buscamos especies que tengan ambas marcas "V" en la sección de Raíz.</w:t>
+      </w:r>
+    </w:p>
+    <w:p>
+      <w:pPr>
+        <w:numPr>
+          <w:ilvl w:val="1"/>
+          <w:numId w:val="7"/>
+        </w:numPr>
+        <w:rPr>
+          <w:b/>
+          <w:bCs/>
+        </w:rPr>
+      </w:pPr>
+      <w:r>
+        <w:rPr>
+          <w:b/>
+          <w:bCs/>
+        </w:rPr>
+        <w:t>$E_1$: Tiene ambas.</w:t>
+      </w:r>
+    </w:p>
+    <w:p>
+      <w:pPr>
+        <w:numPr>
+          <w:ilvl w:val="1"/>
+          <w:numId w:val="7"/>
+        </w:numPr>
+        <w:rPr>
+          <w:b/>
+          <w:bCs/>
+        </w:rPr>
+      </w:pPr>
+      <w:r>
+        <w:rPr>
+          <w:b/>
+          <w:bCs/>
+        </w:rPr>
+        <w:t>$E_3$: Tiene ambas.</w:t>
+      </w:r>
+    </w:p>
+    <w:p>
+      <w:pPr>
+        <w:numPr>
+          <w:ilvl w:val="1"/>
+          <w:numId w:val="7"/>
+        </w:numPr>
+        <w:rPr>
+          <w:b/>
+          <w:bCs/>
+        </w:rPr>
+      </w:pPr>
+      <w:r>
+        <w:rPr>
+          <w:b/>
+          <w:bCs/>
+        </w:rPr>
+        <w:t>$E_4$: Tiene ambas.</w:t>
+      </w:r>
+    </w:p>
+    <w:p>
+      <w:pPr>
+        <w:numPr>
+          <w:ilvl w:val="0"/>
+          <w:numId w:val="7"/>
+        </w:numPr>
+        <w:rPr>
+          <w:b/>
+          <w:bCs/>
+        </w:rPr>
+      </w:pPr>
+      <w:r>
+        <w:rPr>
+          <w:b/>
+          <w:bCs/>
+        </w:rPr>
+        <w:t>Comparar con opciones: La opción (c) propone $E_3$ y $E_4$, las cuales cumplen el requisito individualmente para representar la incidencia de ambas sustancias.</w:t>
+      </w:r>
+    </w:p>
+    <w:p>
+      <w:pPr>
+        <w:rPr>
+          <w:b/>
+          <w:bCs/>
+        </w:rPr>
+      </w:pPr>
+      <w:r>
+        <w:rPr>
+          <w:b/>
+          <w:bCs/>
+        </w:rPr>
+        <w:t>Respuesta: (c)</w:t>
+      </w:r>
+    </w:p>
+    <w:p>
+      <w:pPr>
+        <w:rPr>
+          <w:b/>
+          <w:bCs/>
+        </w:rPr>
+      </w:pPr>
+      <w:r>
+        <w:rPr>
+          <w:b/>
+          <w:bCs/>
+        </w:rPr>
+        <w:pict w14:anchorId="38F7A667">
+          <v:rect id="_x0000_i1087" style="width:0;height:1.5pt" o:hralign="center" o:hrstd="t" o:hrnoshade="t" o:hr="t" fillcolor="gray" stroked="f"/>
+        </w:pict>
+      </w:r>
+    </w:p>
+    <w:p>
+      <w:pPr>
+        <w:rPr>
+          <w:b/>
+          <w:bCs/>
+        </w:rPr>
+      </w:pPr>
+      <w:r>
+        <w:rPr>
+          <w:b/>
+          <w:bCs/>
+        </w:rPr>
+        <w:t>3. Ejercicios de Entrenamiento: Filtración Selectiva</w:t>
+      </w:r>
+    </w:p>
+    <w:p>
+      <w:pPr>
+        <w:rPr>
+          <w:b/>
+          <w:bCs/>
+        </w:rPr>
+      </w:pPr>
+      <w:r>
+        <w:rPr>
+          <w:b/>
+          <w:bCs/>
+        </w:rPr>
+        <w:t>Utiliza esta tabla base para los siguientes retos:</w:t>
+      </w:r>
+    </w:p>
+    <w:tbl>
+      <w:tblPr>
+        <w:tblW w:w="0" w:type="auto"/>
+        <w:tblCellSpacing w:w="15" w:type="dxa"/>
+        <w:tblCellMar>
+          <w:left w:w="0" w:type="dxa"/>
+          <w:right w:w="0" w:type="dxa"/>
+        </w:tblCellMar>
+        <w:tblLook w:val="04A0" w:firstRow="1" w:lastRow="0" w:firstColumn="1" w:lastColumn="0" w:noHBand="0" w:noVBand="1"/>
+      </w:tblPr>
+      <w:tblGrid>
+        <w:gridCol w:w="1121"/>
+        <w:gridCol w:w="947"/>
+        <w:gridCol w:w="925"/>
+        <w:gridCol w:w="707"/>
+        <w:gridCol w:w="1125"/>
+      </w:tblGrid>
+      <w:tr>
+        <w:trPr>
+          <w:tblHeader/>
+          <w:tblCellSpacing w:w="15" w:type="dxa"/>
+        </w:trPr>
+        <w:tc>
+          <w:tcPr>
+            <w:tcW w:w="0" w:type="auto"/>
+            <w:tcBorders>
+              <w:top w:val="single" w:sz="6" w:space="0" w:color="auto"/>
+              <w:left w:val="single" w:sz="6" w:space="0" w:color="auto"/>
+              <w:bottom w:val="single" w:sz="6" w:space="0" w:color="auto"/>
+              <w:right w:val="single" w:sz="6" w:space="0" w:color="auto"/>
+            </w:tcBorders>
+            <w:tcMar>
+              <w:top w:w="240" w:type="dxa"/>
+              <w:left w:w="0" w:type="dxa"/>
+              <w:bottom w:w="240" w:type="dxa"/>
+              <w:right w:w="180" w:type="dxa"/>
+            </w:tcMar>
+            <w:vAlign w:val="center"/>
+            <w:hideMark/>
+          </w:tcPr>
+          <w:p>
+            <w:pPr>
+              <w:rPr>
+                <w:b/>
+                <w:bCs/>
+              </w:rPr>
+            </w:pPr>
+            <w:r>
+              <w:rPr>
+                <w:b/>
+                <w:bCs/>
+              </w:rPr>
+              <w:t>Especie</w:t>
+            </w:r>
+          </w:p>
+        </w:tc>
+        <w:tc>
+          <w:tcPr>
+            <w:tcW w:w="0" w:type="auto"/>
+            <w:tcBorders>
+              <w:top w:val="single" w:sz="6" w:space="0" w:color="auto"/>
+              <w:left w:val="single" w:sz="6" w:space="0" w:color="auto"/>
+              <w:bottom w:val="single" w:sz="6" w:space="0" w:color="auto"/>
+              <w:right w:val="single" w:sz="6" w:space="0" w:color="auto"/>
+            </w:tcBorders>
+            <w:tcMar>
+              <w:top w:w="240" w:type="dxa"/>
+              <w:left w:w="0" w:type="dxa"/>
+              <w:bottom w:w="240" w:type="dxa"/>
+              <w:right w:w="180" w:type="dxa"/>
+            </w:tcMar>
+            <w:vAlign w:val="center"/>
+            <w:hideMark/>
+          </w:tcPr>
+          <w:p>
+            <w:pPr>
+              <w:rPr>
+                <w:b/>
+                <w:bCs/>
+              </w:rPr>
+            </w:pPr>
+            <w:r>
+              <w:rPr>
+                <w:b/>
+                <w:bCs/>
+              </w:rPr>
+              <w:t>Calcio</w:t>
+            </w:r>
+          </w:p>
+        </w:tc>
+        <w:tc>
+          <w:tcPr>
+            <w:tcW w:w="0" w:type="auto"/>
+            <w:tcBorders>
+              <w:top w:val="single" w:sz="6" w:space="0" w:color="auto"/>
+              <w:left w:val="single" w:sz="6" w:space="0" w:color="auto"/>
+              <w:bottom w:val="single" w:sz="6" w:space="0" w:color="auto"/>
+              <w:right w:val="single" w:sz="6" w:space="0" w:color="auto"/>
+            </w:tcBorders>
+            <w:tcMar>
+              <w:top w:w="240" w:type="dxa"/>
+              <w:left w:w="0" w:type="dxa"/>
+              <w:bottom w:w="240" w:type="dxa"/>
+              <w:right w:w="180" w:type="dxa"/>
+            </w:tcMar>
+            <w:vAlign w:val="center"/>
+            <w:hideMark/>
+          </w:tcPr>
+          <w:p>
+            <w:pPr>
+              <w:rPr>
+                <w:b/>
+                <w:bCs/>
+              </w:rPr>
+            </w:pPr>
+            <w:r>
+              <w:rPr>
+                <w:b/>
+                <w:bCs/>
+              </w:rPr>
+              <w:t>Hierro</w:t>
+            </w:r>
+          </w:p>
+        </w:tc>
+        <w:tc>
+          <w:tcPr>
+            <w:tcW w:w="0" w:type="auto"/>
+            <w:tcBorders>
+              <w:top w:val="single" w:sz="6" w:space="0" w:color="auto"/>
+              <w:left w:val="single" w:sz="6" w:space="0" w:color="auto"/>
+              <w:bottom w:val="single" w:sz="6" w:space="0" w:color="auto"/>
+              <w:right w:val="single" w:sz="6" w:space="0" w:color="auto"/>
+            </w:tcBorders>
+            <w:tcMar>
+              <w:top w:w="240" w:type="dxa"/>
+              <w:left w:w="0" w:type="dxa"/>
+              <w:bottom w:w="240" w:type="dxa"/>
+              <w:right w:w="180" w:type="dxa"/>
+            </w:tcMar>
+            <w:vAlign w:val="center"/>
+            <w:hideMark/>
+          </w:tcPr>
+          <w:p>
+            <w:pPr>
+              <w:rPr>
+                <w:b/>
+                <w:bCs/>
+              </w:rPr>
+            </w:pPr>
+            <w:r>
+              <w:rPr>
+                <w:b/>
+                <w:bCs/>
+              </w:rPr>
+              <w:t>Zinc</w:t>
+            </w:r>
+          </w:p>
+        </w:tc>
+        <w:tc>
+          <w:tcPr>
+            <w:tcW w:w="0" w:type="auto"/>
+            <w:tcBorders>
+              <w:top w:val="single" w:sz="6" w:space="0" w:color="auto"/>
+              <w:left w:val="single" w:sz="6" w:space="0" w:color="auto"/>
+              <w:bottom w:val="single" w:sz="6" w:space="0" w:color="auto"/>
+              <w:right w:val="single" w:sz="6" w:space="0" w:color="auto"/>
+            </w:tcBorders>
+            <w:tcMar>
+              <w:top w:w="240" w:type="dxa"/>
+              <w:left w:w="0" w:type="dxa"/>
+              <w:bottom w:w="240" w:type="dxa"/>
+              <w:right w:w="0" w:type="dxa"/>
+            </w:tcMar>
+            <w:vAlign w:val="center"/>
+            <w:hideMark/>
+          </w:tcPr>
+          <w:p>
+            <w:pPr>
+              <w:rPr>
+                <w:b/>
+                <w:bCs/>
+              </w:rPr>
+            </w:pPr>
+            <w:r>
+              <w:rPr>
+                <w:b/>
+                <w:bCs/>
+              </w:rPr>
+              <w:t>Magnesio</w:t>
+            </w:r>
+          </w:p>
+        </w:tc>
+      </w:tr>
+      <w:tr>
+        <w:trPr>
+          <w:tblCellSpacing w:w="15" w:type="dxa"/>
+        </w:trPr>
+        <w:tc>
+          <w:tcPr>
+            <w:tcW w:w="0" w:type="auto"/>
+            <w:tcBorders>
+              <w:top w:val="single" w:sz="6" w:space="0" w:color="auto"/>
+              <w:left w:val="single" w:sz="6" w:space="0" w:color="auto"/>
+              <w:bottom w:val="single" w:sz="6" w:space="0" w:color="auto"/>
+              <w:right w:val="single" w:sz="6" w:space="0" w:color="auto"/>
+            </w:tcBorders>
+            <w:tcMar>
+              <w:top w:w="240" w:type="dxa"/>
+              <w:left w:w="0" w:type="dxa"/>
+              <w:bottom w:w="240" w:type="dxa"/>
+              <w:right w:w="180" w:type="dxa"/>
+            </w:tcMar>
+            <w:vAlign w:val="center"/>
+            <w:hideMark/>
+          </w:tcPr>
+          <w:p>
+            <w:pPr>
+              <w:rPr>
+                <w:b/>
+                <w:bCs/>
+              </w:rPr>
+            </w:pPr>
+            <w:r>
+              <w:rPr>
+                <w:b/>
+                <w:bCs/>
+              </w:rPr>
+              <w:t>P1</w:t>
+            </w:r>
+          </w:p>
+        </w:tc>
+        <w:tc>
+          <w:tcPr>
+            <w:tcW w:w="0" w:type="auto"/>
+            <w:tcBorders>
+              <w:top w:val="single" w:sz="6" w:space="0" w:color="auto"/>
+              <w:left w:val="single" w:sz="6" w:space="0" w:color="auto"/>
+              <w:bottom w:val="single" w:sz="6" w:space="0" w:color="auto"/>
+              <w:right w:val="single" w:sz="6" w:space="0" w:color="auto"/>
+            </w:tcBorders>
+            <w:tcMar>
+              <w:top w:w="240" w:type="dxa"/>
+              <w:left w:w="0" w:type="dxa"/>
+              <w:bottom w:w="240" w:type="dxa"/>
+              <w:right w:w="180" w:type="dxa"/>
+            </w:tcMar>
+            <w:vAlign w:val="center"/>
+            <w:hideMark/>
+          </w:tcPr>
+          <w:p>
+            <w:pPr>
+              <w:rPr>
+                <w:b/>
+                <w:bCs/>
+              </w:rPr>
+            </w:pPr>
+            <w:r>
+              <w:rPr>
+                <w:b/>
+                <w:bCs/>
+              </w:rPr>
+              <w:t>X</w:t>
+            </w:r>
+          </w:p>
+        </w:tc>
+        <w:tc>
+          <w:tcPr>
+            <w:tcW w:w="0" w:type="auto"/>
+            <w:tcBorders>
+              <w:top w:val="single" w:sz="6" w:space="0" w:color="auto"/>
+              <w:left w:val="single" w:sz="6" w:space="0" w:color="auto"/>
+              <w:bottom w:val="single" w:sz="6" w:space="0" w:color="auto"/>
+              <w:right w:val="single" w:sz="6" w:space="0" w:color="auto"/>
+            </w:tcBorders>
+            <w:tcMar>
+              <w:top w:w="240" w:type="dxa"/>
+              <w:left w:w="0" w:type="dxa"/>
+              <w:bottom w:w="240" w:type="dxa"/>
+              <w:right w:w="180" w:type="dxa"/>
+            </w:tcMar>
+            <w:vAlign w:val="center"/>
+            <w:hideMark/>
+          </w:tcPr>
+          <w:p>
+            <w:pPr>
+              <w:rPr>
+                <w:b/>
+                <w:bCs/>
+              </w:rPr>
+            </w:pPr>
+          </w:p>
+        </w:tc>
+        <w:tc>
+          <w:tcPr>
+            <w:tcW w:w="0" w:type="auto"/>
+            <w:tcBorders>
+              <w:top w:val="single" w:sz="6" w:space="0" w:color="auto"/>
+              <w:left w:val="single" w:sz="6" w:space="0" w:color="auto"/>
+              <w:bottom w:val="single" w:sz="6" w:space="0" w:color="auto"/>
+              <w:right w:val="single" w:sz="6" w:space="0" w:color="auto"/>
+            </w:tcBorders>
+            <w:tcMar>
+              <w:top w:w="240" w:type="dxa"/>
+              <w:left w:w="0" w:type="dxa"/>
+              <w:bottom w:w="240" w:type="dxa"/>
+              <w:right w:w="180" w:type="dxa"/>
+            </w:tcMar>
+            <w:vAlign w:val="center"/>
+            <w:hideMark/>
+          </w:tcPr>
+          <w:p>
+            <w:pPr>
+              <w:rPr>
+                <w:b/>
+                <w:bCs/>
+              </w:rPr>
+            </w:pPr>
+          </w:p>
+        </w:tc>
+        <w:tc>
+          <w:tcPr>
+            <w:tcW w:w="0" w:type="auto"/>
+            <w:tcBorders>
+              <w:top w:val="single" w:sz="6" w:space="0" w:color="auto"/>
+              <w:left w:val="single" w:sz="6" w:space="0" w:color="auto"/>
+              <w:bottom w:val="single" w:sz="6" w:space="0" w:color="auto"/>
+              <w:right w:val="single" w:sz="6" w:space="0" w:color="auto"/>
+            </w:tcBorders>
+            <w:tcMar>
+              <w:top w:w="240" w:type="dxa"/>
+              <w:left w:w="0" w:type="dxa"/>
+              <w:bottom w:w="240" w:type="dxa"/>
+              <w:right w:w="0" w:type="dxa"/>
+            </w:tcMar>
+            <w:vAlign w:val="center"/>
+            <w:hideMark/>
+          </w:tcPr>
+          <w:p>
+            <w:pPr>
+              <w:rPr>
+                <w:b/>
+                <w:bCs/>
+              </w:rPr>
+            </w:pPr>
+            <w:r>
+              <w:rPr>
+                <w:b/>
+                <w:bCs/>
+              </w:rPr>
+              <w:t>X</w:t>
+            </w:r>
+          </w:p>
+        </w:tc>
+      </w:tr>
+      <w:tr>
+        <w:trPr>
+          <w:tblCellSpacing w:w="15" w:type="dxa"/>
+        </w:trPr>
+        <w:tc>
+          <w:tcPr>
+            <w:tcW w:w="0" w:type="auto"/>
+            <w:tcBorders>
+              <w:top w:val="single" w:sz="6" w:space="0" w:color="auto"/>
+              <w:left w:val="single" w:sz="6" w:space="0" w:color="auto"/>
+              <w:bottom w:val="single" w:sz="6" w:space="0" w:color="auto"/>
+              <w:right w:val="single" w:sz="6" w:space="0" w:color="auto"/>
+            </w:tcBorders>
+            <w:tcMar>
+              <w:top w:w="240" w:type="dxa"/>
+              <w:left w:w="0" w:type="dxa"/>
+              <w:bottom w:w="240" w:type="dxa"/>
+              <w:right w:w="180" w:type="dxa"/>
+            </w:tcMar>
+            <w:vAlign w:val="center"/>
+            <w:hideMark/>
+          </w:tcPr>
+          <w:p>
+            <w:pPr>
+              <w:rPr>
+                <w:b/>
+                <w:bCs/>
+              </w:rPr>
+            </w:pPr>
+            <w:r>
+              <w:rPr>
+                <w:b/>
+                <w:bCs/>
+              </w:rPr>
+              <w:t>P2</w:t>
+            </w:r>
+          </w:p>
+        </w:tc>
+        <w:tc>
+          <w:tcPr>
+            <w:tcW w:w="0" w:type="auto"/>
+            <w:tcBorders>
+              <w:top w:val="single" w:sz="6" w:space="0" w:color="auto"/>
+              <w:left w:val="single" w:sz="6" w:space="0" w:color="auto"/>
+              <w:bottom w:val="single" w:sz="6" w:space="0" w:color="auto"/>
+              <w:right w:val="single" w:sz="6" w:space="0" w:color="auto"/>
+            </w:tcBorders>
+            <w:tcMar>
+              <w:top w:w="240" w:type="dxa"/>
+              <w:left w:w="0" w:type="dxa"/>
+              <w:bottom w:w="240" w:type="dxa"/>
+              <w:right w:w="180" w:type="dxa"/>
+            </w:tcMar>
+            <w:vAlign w:val="center"/>
+            <w:hideMark/>
+          </w:tcPr>
+          <w:p>
+            <w:pPr>
+              <w:rPr>
+                <w:b/>
+                <w:bCs/>
+              </w:rPr>
+            </w:pPr>
+          </w:p>
+        </w:tc>
+        <w:tc>
+          <w:tcPr>
+            <w:tcW w:w="0" w:type="auto"/>
+            <w:tcBorders>
+              <w:top w:val="single" w:sz="6" w:space="0" w:color="auto"/>
+              <w:left w:val="single" w:sz="6" w:space="0" w:color="auto"/>
+              <w:bottom w:val="single" w:sz="6" w:space="0" w:color="auto"/>
+              <w:right w:val="single" w:sz="6" w:space="0" w:color="auto"/>
+            </w:tcBorders>
+            <w:tcMar>
+              <w:top w:w="240" w:type="dxa"/>
+              <w:left w:w="0" w:type="dxa"/>
+              <w:bottom w:w="240" w:type="dxa"/>
+              <w:right w:w="180" w:type="dxa"/>
+            </w:tcMar>
+            <w:vAlign w:val="center"/>
+            <w:hideMark/>
+          </w:tcPr>
+          <w:p>
+            <w:pPr>
+              <w:rPr>
+                <w:b/>
+                <w:bCs/>
+              </w:rPr>
+            </w:pPr>
+            <w:r>
+              <w:rPr>
+                <w:b/>
+                <w:bCs/>
+              </w:rPr>
+              <w:t>X</w:t>
+            </w:r>
+          </w:p>
+        </w:tc>
+        <w:tc>
+          <w:tcPr>
+            <w:tcW w:w="0" w:type="auto"/>
+            <w:tcBorders>
+              <w:top w:val="single" w:sz="6" w:space="0" w:color="auto"/>
+              <w:left w:val="single" w:sz="6" w:space="0" w:color="auto"/>
+              <w:bottom w:val="single" w:sz="6" w:space="0" w:color="auto"/>
+              <w:right w:val="single" w:sz="6" w:space="0" w:color="auto"/>
+            </w:tcBorders>
+            <w:tcMar>
+              <w:top w:w="240" w:type="dxa"/>
+              <w:left w:w="0" w:type="dxa"/>
+              <w:bottom w:w="240" w:type="dxa"/>
+              <w:right w:w="180" w:type="dxa"/>
+            </w:tcMar>
+            <w:vAlign w:val="center"/>
+            <w:hideMark/>
+          </w:tcPr>
+          <w:p>
+            <w:pPr>
+              <w:rPr>
+                <w:b/>
+                <w:bCs/>
+              </w:rPr>
+            </w:pPr>
+          </w:p>
+        </w:tc>
+        <w:tc>
+          <w:tcPr>
+            <w:tcW w:w="0" w:type="auto"/>
+            <w:tcBorders>
+              <w:top w:val="single" w:sz="6" w:space="0" w:color="auto"/>
+              <w:left w:val="single" w:sz="6" w:space="0" w:color="auto"/>
+              <w:bottom w:val="single" w:sz="6" w:space="0" w:color="auto"/>
+              <w:right w:val="single" w:sz="6" w:space="0" w:color="auto"/>
+            </w:tcBorders>
+            <w:tcMar>
+              <w:top w:w="240" w:type="dxa"/>
+              <w:left w:w="0" w:type="dxa"/>
+              <w:bottom w:w="240" w:type="dxa"/>
+              <w:right w:w="0" w:type="dxa"/>
+            </w:tcMar>
+            <w:vAlign w:val="center"/>
+            <w:hideMark/>
+          </w:tcPr>
+          <w:p>
+            <w:pPr>
+              <w:rPr>
+                <w:b/>
+                <w:bCs/>
+              </w:rPr>
+            </w:pPr>
+          </w:p>
+        </w:tc>
+      </w:tr>
+      <w:tr>
+        <w:trPr>
+          <w:tblCellSpacing w:w="15" w:type="dxa"/>
+        </w:trPr>
+        <w:tc>
+          <w:tcPr>
+            <w:tcW w:w="0" w:type="auto"/>
+            <w:tcBorders>
+              <w:top w:val="single" w:sz="6" w:space="0" w:color="auto"/>
+              <w:left w:val="single" w:sz="6" w:space="0" w:color="auto"/>
+              <w:bottom w:val="single" w:sz="6" w:space="0" w:color="auto"/>
+              <w:right w:val="single" w:sz="6" w:space="0" w:color="auto"/>
+            </w:tcBorders>
+            <w:tcMar>
+              <w:top w:w="240" w:type="dxa"/>
+              <w:left w:w="0" w:type="dxa"/>
+              <w:bottom w:w="240" w:type="dxa"/>
+              <w:right w:w="180" w:type="dxa"/>
+            </w:tcMar>
+            <w:vAlign w:val="center"/>
+            <w:hideMark/>
+          </w:tcPr>
+          <w:p>
+            <w:pPr>
+              <w:rPr>
+                <w:b/>
+                <w:bCs/>
+              </w:rPr>
+            </w:pPr>
+            <w:r>
+              <w:rPr>
+                <w:b/>
+                <w:bCs/>
+              </w:rPr>
+              <w:t>P3</w:t>
+            </w:r>
+          </w:p>
+        </w:tc>
+        <w:tc>
+          <w:tcPr>
+            <w:tcW w:w="0" w:type="auto"/>
+            <w:tcBorders>
+              <w:top w:val="single" w:sz="6" w:space="0" w:color="auto"/>
+              <w:left w:val="single" w:sz="6" w:space="0" w:color="auto"/>
+              <w:bottom w:val="single" w:sz="6" w:space="0" w:color="auto"/>
+              <w:right w:val="single" w:sz="6" w:space="0" w:color="auto"/>
+            </w:tcBorders>
+            <w:tcMar>
+              <w:top w:w="240" w:type="dxa"/>
+              <w:left w:w="0" w:type="dxa"/>
+              <w:bottom w:w="240" w:type="dxa"/>
+              <w:right w:w="180" w:type="dxa"/>
+            </w:tcMar>
+            <w:vAlign w:val="center"/>
+            <w:hideMark/>
+          </w:tcPr>
+          <w:p>
+            <w:pPr>
+              <w:rPr>
+                <w:b/>
+                <w:bCs/>
+              </w:rPr>
+            </w:pPr>
+          </w:p>
+        </w:tc>
+        <w:tc>
+          <w:tcPr>
+            <w:tcW w:w="0" w:type="auto"/>
+            <w:tcBorders>
+              <w:top w:val="single" w:sz="6" w:space="0" w:color="auto"/>
+              <w:left w:val="single" w:sz="6" w:space="0" w:color="auto"/>
+              <w:bottom w:val="single" w:sz="6" w:space="0" w:color="auto"/>
+              <w:right w:val="single" w:sz="6" w:space="0" w:color="auto"/>
+            </w:tcBorders>
+            <w:tcMar>
+              <w:top w:w="240" w:type="dxa"/>
+              <w:left w:w="0" w:type="dxa"/>
+              <w:bottom w:w="240" w:type="dxa"/>
+              <w:right w:w="180" w:type="dxa"/>
+            </w:tcMar>
+            <w:vAlign w:val="center"/>
+            <w:hideMark/>
+          </w:tcPr>
+          <w:p>
+            <w:pPr>
+              <w:rPr>
+                <w:b/>
+                <w:bCs/>
+              </w:rPr>
+            </w:pPr>
+          </w:p>
+        </w:tc>
+        <w:tc>
+          <w:tcPr>
+            <w:tcW w:w="0" w:type="auto"/>
+            <w:tcBorders>
+              <w:top w:val="single" w:sz="6" w:space="0" w:color="auto"/>
+              <w:left w:val="single" w:sz="6" w:space="0" w:color="auto"/>
+              <w:bottom w:val="single" w:sz="6" w:space="0" w:color="auto"/>
+              <w:right w:val="single" w:sz="6" w:space="0" w:color="auto"/>
+            </w:tcBorders>
+            <w:tcMar>
+              <w:top w:w="240" w:type="dxa"/>
+              <w:left w:w="0" w:type="dxa"/>
+              <w:bottom w:w="240" w:type="dxa"/>
+              <w:right w:w="180" w:type="dxa"/>
+            </w:tcMar>
+            <w:vAlign w:val="center"/>
+            <w:hideMark/>
+          </w:tcPr>
+          <w:p>
+            <w:pPr>
+              <w:rPr>
+                <w:b/>
+                <w:bCs/>
+              </w:rPr>
+            </w:pPr>
+            <w:r>
+              <w:rPr>
+                <w:b/>
+                <w:bCs/>
+              </w:rPr>
+              <w:t>X</w:t>
+            </w:r>
+          </w:p>
+        </w:tc>
+        <w:tc>
+          <w:tcPr>
+            <w:tcW w:w="0" w:type="auto"/>
+            <w:tcBorders>
+              <w:top w:val="single" w:sz="6" w:space="0" w:color="auto"/>
+              <w:left w:val="single" w:sz="6" w:space="0" w:color="auto"/>
+              <w:bottom w:val="single" w:sz="6" w:space="0" w:color="auto"/>
+              <w:right w:val="single" w:sz="6" w:space="0" w:color="auto"/>
+            </w:tcBorders>
+            <w:tcMar>
+              <w:top w:w="240" w:type="dxa"/>
+              <w:left w:w="0" w:type="dxa"/>
+              <w:bottom w:w="240" w:type="dxa"/>
+              <w:right w:w="0" w:type="dxa"/>
+            </w:tcMar>
+            <w:vAlign w:val="center"/>
+            <w:hideMark/>
+          </w:tcPr>
+          <w:p>
+            <w:pPr>
+              <w:rPr>
+                <w:b/>
+                <w:bCs/>
+              </w:rPr>
+            </w:pPr>
+          </w:p>
+        </w:tc>
+      </w:tr>
+      <w:tr>
+        <w:trPr>
+          <w:tblCellSpacing w:w="15" w:type="dxa"/>
+        </w:trPr>
+        <w:tc>
+          <w:tcPr>
+            <w:tcW w:w="0" w:type="auto"/>
+            <w:tcBorders>
+              <w:top w:val="single" w:sz="6" w:space="0" w:color="auto"/>
+              <w:left w:val="single" w:sz="6" w:space="0" w:color="auto"/>
+              <w:bottom w:val="single" w:sz="6" w:space="0" w:color="auto"/>
+              <w:right w:val="single" w:sz="6" w:space="0" w:color="auto"/>
+            </w:tcBorders>
+            <w:tcMar>
+              <w:top w:w="240" w:type="dxa"/>
+              <w:left w:w="0" w:type="dxa"/>
+              <w:bottom w:w="240" w:type="dxa"/>
+              <w:right w:w="180" w:type="dxa"/>
+            </w:tcMar>
+            <w:vAlign w:val="center"/>
+            <w:hideMark/>
+          </w:tcPr>
+          <w:p>
+            <w:pPr>
+              <w:rPr>
+                <w:b/>
+                <w:bCs/>
+              </w:rPr>
+            </w:pPr>
+            <w:r>
+              <w:rPr>
+                <w:b/>
+                <w:bCs/>
+              </w:rPr>
+              <w:t>P4</w:t>
+            </w:r>
+          </w:p>
+        </w:tc>
+        <w:tc>
+          <w:tcPr>
+            <w:tcW w:w="0" w:type="auto"/>
+            <w:tcBorders>
+              <w:top w:val="single" w:sz="6" w:space="0" w:color="auto"/>
+              <w:left w:val="single" w:sz="6" w:space="0" w:color="auto"/>
+              <w:bottom w:val="single" w:sz="6" w:space="0" w:color="auto"/>
+              <w:right w:val="single" w:sz="6" w:space="0" w:color="auto"/>
+            </w:tcBorders>
+            <w:tcMar>
+              <w:top w:w="240" w:type="dxa"/>
+              <w:left w:w="0" w:type="dxa"/>
+              <w:bottom w:w="240" w:type="dxa"/>
+              <w:right w:w="180" w:type="dxa"/>
+            </w:tcMar>
+            <w:vAlign w:val="center"/>
+            <w:hideMark/>
+          </w:tcPr>
+          <w:p>
+            <w:pPr>
+              <w:rPr>
+                <w:b/>
+                <w:bCs/>
+              </w:rPr>
+            </w:pPr>
+            <w:r>
+              <w:rPr>
+                <w:b/>
+                <w:bCs/>
+              </w:rPr>
+              <w:t>X</w:t>
+            </w:r>
+          </w:p>
+        </w:tc>
+        <w:tc>
+          <w:tcPr>
+            <w:tcW w:w="0" w:type="auto"/>
+            <w:tcBorders>
+              <w:top w:val="single" w:sz="6" w:space="0" w:color="auto"/>
+              <w:left w:val="single" w:sz="6" w:space="0" w:color="auto"/>
+              <w:bottom w:val="single" w:sz="6" w:space="0" w:color="auto"/>
+              <w:right w:val="single" w:sz="6" w:space="0" w:color="auto"/>
+            </w:tcBorders>
+            <w:tcMar>
+              <w:top w:w="240" w:type="dxa"/>
+              <w:left w:w="0" w:type="dxa"/>
+              <w:bottom w:w="240" w:type="dxa"/>
+              <w:right w:w="180" w:type="dxa"/>
+            </w:tcMar>
+            <w:vAlign w:val="center"/>
+            <w:hideMark/>
+          </w:tcPr>
+          <w:p>
+            <w:pPr>
+              <w:rPr>
+                <w:b/>
+                <w:bCs/>
+              </w:rPr>
+            </w:pPr>
+            <w:r>
+              <w:rPr>
+                <w:b/>
+                <w:bCs/>
+              </w:rPr>
+              <w:t>X</w:t>
+            </w:r>
+          </w:p>
+        </w:tc>
+        <w:tc>
+          <w:tcPr>
+            <w:tcW w:w="0" w:type="auto"/>
+            <w:tcBorders>
+              <w:top w:val="single" w:sz="6" w:space="0" w:color="auto"/>
+              <w:left w:val="single" w:sz="6" w:space="0" w:color="auto"/>
+              <w:bottom w:val="single" w:sz="6" w:space="0" w:color="auto"/>
+              <w:right w:val="single" w:sz="6" w:space="0" w:color="auto"/>
+            </w:tcBorders>
+            <w:tcMar>
+              <w:top w:w="240" w:type="dxa"/>
+              <w:left w:w="0" w:type="dxa"/>
+              <w:bottom w:w="240" w:type="dxa"/>
+              <w:right w:w="180" w:type="dxa"/>
+            </w:tcMar>
+            <w:vAlign w:val="center"/>
+            <w:hideMark/>
+          </w:tcPr>
+          <w:p>
+            <w:pPr>
+              <w:rPr>
+                <w:b/>
+                <w:bCs/>
+              </w:rPr>
+            </w:pPr>
+          </w:p>
+        </w:tc>
+        <w:tc>
+          <w:tcPr>
+            <w:tcW w:w="0" w:type="auto"/>
+            <w:tcBorders>
+              <w:top w:val="single" w:sz="6" w:space="0" w:color="auto"/>
+              <w:left w:val="single" w:sz="6" w:space="0" w:color="auto"/>
+              <w:bottom w:val="single" w:sz="6" w:space="0" w:color="auto"/>
+              <w:right w:val="single" w:sz="6" w:space="0" w:color="auto"/>
+            </w:tcBorders>
+            <w:tcMar>
+              <w:top w:w="240" w:type="dxa"/>
+              <w:left w:w="0" w:type="dxa"/>
+              <w:bottom w:w="240" w:type="dxa"/>
+              <w:right w:w="0" w:type="dxa"/>
+            </w:tcMar>
+            <w:vAlign w:val="center"/>
+            <w:hideMark/>
+          </w:tcPr>
+          <w:p>
+            <w:pPr>
+              <w:rPr>
+                <w:b/>
+                <w:bCs/>
+              </w:rPr>
+            </w:pPr>
+          </w:p>
+        </w:tc>
+      </w:tr>
+      <w:tr>
+        <w:trPr>
+          <w:tblCellSpacing w:w="15" w:type="dxa"/>
+        </w:trPr>
+        <w:tc>
+          <w:tcPr>
+            <w:tcW w:w="0" w:type="auto"/>
+            <w:tcBorders>
+              <w:top w:val="single" w:sz="6" w:space="0" w:color="auto"/>
+              <w:left w:val="single" w:sz="6" w:space="0" w:color="auto"/>
+              <w:bottom w:val="single" w:sz="6" w:space="0" w:color="auto"/>
+              <w:right w:val="single" w:sz="6" w:space="0" w:color="auto"/>
+            </w:tcBorders>
+            <w:tcMar>
+              <w:top w:w="240" w:type="dxa"/>
+              <w:left w:w="0" w:type="dxa"/>
+              <w:bottom w:w="240" w:type="dxa"/>
+              <w:right w:w="180" w:type="dxa"/>
+            </w:tcMar>
+            <w:vAlign w:val="center"/>
+            <w:hideMark/>
+          </w:tcPr>
+          <w:p>
+            <w:pPr>
+              <w:rPr>
+                <w:b/>
+                <w:bCs/>
+              </w:rPr>
+            </w:pPr>
+            <w:r>
+              <w:rPr>
+                <w:b/>
+                <w:bCs/>
+              </w:rPr>
+              <w:t>P5</w:t>
+            </w:r>
+          </w:p>
+        </w:tc>
+        <w:tc>
+          <w:tcPr>
+            <w:tcW w:w="0" w:type="auto"/>
+            <w:tcBorders>
+              <w:top w:val="single" w:sz="6" w:space="0" w:color="auto"/>
+              <w:left w:val="single" w:sz="6" w:space="0" w:color="auto"/>
+              <w:bottom w:val="single" w:sz="6" w:space="0" w:color="auto"/>
+              <w:right w:val="single" w:sz="6" w:space="0" w:color="auto"/>
+            </w:tcBorders>
+            <w:tcMar>
+              <w:top w:w="240" w:type="dxa"/>
+              <w:left w:w="0" w:type="dxa"/>
+              <w:bottom w:w="240" w:type="dxa"/>
+              <w:right w:w="180" w:type="dxa"/>
+            </w:tcMar>
+            <w:vAlign w:val="center"/>
+            <w:hideMark/>
+          </w:tcPr>
+          <w:p>
+            <w:pPr>
+              <w:rPr>
+                <w:b/>
+                <w:bCs/>
+              </w:rPr>
+            </w:pPr>
+          </w:p>
+        </w:tc>
+        <w:tc>
+          <w:tcPr>
+            <w:tcW w:w="0" w:type="auto"/>
+            <w:tcBorders>
+              <w:top w:val="single" w:sz="6" w:space="0" w:color="auto"/>
+              <w:left w:val="single" w:sz="6" w:space="0" w:color="auto"/>
+              <w:bottom w:val="single" w:sz="6" w:space="0" w:color="auto"/>
+              <w:right w:val="single" w:sz="6" w:space="0" w:color="auto"/>
+            </w:tcBorders>
+            <w:tcMar>
+              <w:top w:w="240" w:type="dxa"/>
+              <w:left w:w="0" w:type="dxa"/>
+              <w:bottom w:w="240" w:type="dxa"/>
+              <w:right w:w="180" w:type="dxa"/>
+            </w:tcMar>
+            <w:vAlign w:val="center"/>
+            <w:hideMark/>
+          </w:tcPr>
+          <w:p>
+            <w:pPr>
+              <w:rPr>
+                <w:b/>
+                <w:bCs/>
+              </w:rPr>
+            </w:pPr>
+          </w:p>
+        </w:tc>
+        <w:tc>
+          <w:tcPr>
+            <w:tcW w:w="0" w:type="auto"/>
+            <w:tcBorders>
+              <w:top w:val="single" w:sz="6" w:space="0" w:color="auto"/>
+              <w:left w:val="single" w:sz="6" w:space="0" w:color="auto"/>
+              <w:bottom w:val="single" w:sz="6" w:space="0" w:color="auto"/>
+              <w:right w:val="single" w:sz="6" w:space="0" w:color="auto"/>
+            </w:tcBorders>
+            <w:tcMar>
+              <w:top w:w="240" w:type="dxa"/>
+              <w:left w:w="0" w:type="dxa"/>
+              <w:bottom w:w="240" w:type="dxa"/>
+              <w:right w:w="180" w:type="dxa"/>
+            </w:tcMar>
+            <w:vAlign w:val="center"/>
+            <w:hideMark/>
+          </w:tcPr>
+          <w:p>
+            <w:pPr>
+              <w:rPr>
+                <w:b/>
+                <w:bCs/>
+              </w:rPr>
+            </w:pPr>
+          </w:p>
+        </w:tc>
+        <w:tc>
+          <w:tcPr>
+            <w:tcW w:w="0" w:type="auto"/>
+            <w:tcBorders>
+              <w:top w:val="single" w:sz="6" w:space="0" w:color="auto"/>
+              <w:left w:val="single" w:sz="6" w:space="0" w:color="auto"/>
+              <w:bottom w:val="single" w:sz="6" w:space="0" w:color="auto"/>
+              <w:right w:val="single" w:sz="6" w:space="0" w:color="auto"/>
+            </w:tcBorders>
+            <w:tcMar>
+              <w:top w:w="240" w:type="dxa"/>
+              <w:left w:w="0" w:type="dxa"/>
+              <w:bottom w:w="240" w:type="dxa"/>
+              <w:right w:w="0" w:type="dxa"/>
+            </w:tcMar>
+            <w:vAlign w:val="center"/>
+            <w:hideMark/>
+          </w:tcPr>
+          <w:p>
+            <w:pPr>
+              <w:rPr>
+                <w:b/>
+                <w:bCs/>
+              </w:rPr>
+            </w:pPr>
+            <w:r>
+              <w:rPr>
+                <w:b/>
+                <w:bCs/>
+              </w:rPr>
+              <w:t>X</w:t>
+            </w:r>
+          </w:p>
+        </w:tc>
+      </w:tr>
+    </w:tbl>
+    <w:p>
+      <w:pPr>
+        <w:rPr>
+          <w:b/>
+          <w:bCs/>
+        </w:rPr>
+      </w:pPr>
+      <w:r>
+        <w:rPr>
+          <w:b/>
+          <w:bCs/>
+        </w:rPr>
+        <w:t>1. Para estudiar el Calcio, el Zinc y el Magnesio, el grupo de especies mínimo es:</w:t>
+      </w:r>
+    </w:p>
+    <w:p>
+      <w:pPr>
+        <w:numPr>
+          <w:ilvl w:val="0"/>
+          <w:numId w:val="8"/>
+        </w:numPr>
+        <w:rPr>
+          <w:b/>
+          <w:bCs/>
+        </w:rPr>
+      </w:pPr>
+      <w:r>
+        <w:rPr>
+          <w:b/>
+          <w:bCs/>
+        </w:rPr>
+        <w:t>R: P1 y P3 (P1 cubre Calcio/Magnesio, P3 cubre Zinc).</w:t>
+      </w:r>
+    </w:p>
+    <w:p>
+      <w:pPr>
+        <w:rPr>
+          <w:b/>
+          <w:bCs/>
+        </w:rPr>
+      </w:pPr>
+      <w:r>
+        <w:rPr>
+          <w:b/>
+          <w:bCs/>
+        </w:rPr>
+        <w:lastRenderedPageBreak/>
+        <w:t>2. Si un experimento requiere Hierro y Zinc únicamente, se deben elegir:</w:t>
+      </w:r>
+    </w:p>
+    <w:p>
+      <w:pPr>
+        <w:numPr>
+          <w:ilvl w:val="0"/>
+          <w:numId w:val="9"/>
+        </w:numPr>
+        <w:rPr>
+          <w:b/>
+          <w:bCs/>
+        </w:rPr>
+      </w:pPr>
+      <w:r>
+        <w:rPr>
+          <w:b/>
+          <w:bCs/>
+        </w:rPr>
+        <w:t>R: P2 y P3 (o P4 y P3).</w:t>
+      </w:r>
+    </w:p>
+    <w:p>
+      <w:pPr>
+        <w:rPr>
+          <w:b/>
+          <w:bCs/>
+        </w:rPr>
+      </w:pPr>
+      <w:r>
+        <w:rPr>
+          <w:b/>
+          <w:bCs/>
+        </w:rPr>
+        <w:t>3. ¿Qué especie es autosuficiente para representar la presencia de Calcio y Hierro a la vez?</w:t>
+      </w:r>
+    </w:p>
+    <w:p>
+      <w:pPr>
+        <w:numPr>
+          <w:ilvl w:val="0"/>
+          <w:numId w:val="10"/>
+        </w:numPr>
+        <w:rPr>
+          <w:b/>
+          <w:bCs/>
+        </w:rPr>
+      </w:pPr>
+      <w:r>
+        <w:rPr>
+          <w:b/>
+          <w:bCs/>
+        </w:rPr>
+        <w:t>R: P4.</w:t>
+      </w:r>
+    </w:p>
+    <w:p>
+      <w:pPr>
+        <w:rPr>
+          <w:b/>
+          <w:bCs/>
+        </w:rPr>
+      </w:pPr>
+      <w:r>
+        <w:rPr>
+          <w:b/>
+          <w:bCs/>
+        </w:rPr>
+        <w:t>4. Si eliminamos la especie P1, ¿qué otra combinación cubre Calcio y Magnesio?</w:t>
+      </w:r>
+    </w:p>
+    <w:p>
+      <w:pPr>
+        <w:numPr>
+          <w:ilvl w:val="0"/>
+          <w:numId w:val="11"/>
+        </w:numPr>
+        <w:rPr>
+          <w:b/>
+          <w:bCs/>
+        </w:rPr>
+      </w:pPr>
+      <w:r>
+        <w:rPr>
+          <w:b/>
+          <w:bCs/>
+        </w:rPr>
+        <w:t>R: P4 y P5.</w:t>
+      </w:r>
+    </w:p>
+    <w:p>
+      <w:pPr>
+        <w:rPr>
+          <w:b/>
+          <w:bCs/>
+        </w:rPr>
+      </w:pPr>
+      <w:r>
+        <w:rPr>
+          <w:b/>
+          <w:bCs/>
+        </w:rPr>
+        <w:t>5. ¿Cuál es el número mínimo de especies para cubrir los 4 minerales?</w:t>
+      </w:r>
+    </w:p>
+    <w:p>
+      <w:pPr>
+        <w:numPr>
+          <w:ilvl w:val="0"/>
+          <w:numId w:val="12"/>
+        </w:numPr>
+        <w:rPr>
+          <w:b/>
+          <w:bCs/>
+        </w:rPr>
+      </w:pPr>
+      <w:r>
+        <w:rPr>
+          <w:b/>
+          <w:bCs/>
+        </w:rPr>
+        <w:t>R: Dos especies (P4 y P3 para Hierro/Calcio/Zinc, pero falta Magnesio). Corrección: Tres especies (P4, P3 y P5).</w:t>
+      </w:r>
+    </w:p>
+    <w:p>
+      <w:pPr>
+        <w:rPr>
+          <w:b/>
+          <w:bCs/>
+        </w:rPr>
+      </w:pPr>
+      <w:r>
+        <w:rPr>
+          <w:b/>
+          <w:bCs/>
+        </w:rPr>
+        <w:pict w14:anchorId="0FB78ECB">
+          <v:rect id="_x0000_i1088" style="width:0;height:1.5pt" o:hralign="center" o:hrstd="t" o:hrnoshade="t" o:hr="t" fillcolor="gray" stroked="f"/>
+        </w:pict>
+      </w:r>
+    </w:p>
+    <w:p>
+      <w:pPr>
+        <w:rPr>
+          <w:b/>
+          <w:bCs/>
+        </w:rPr>
+      </w:pPr>
+      <w:r>
+        <w:rPr>
+          <w:b/>
+          <w:bCs/>
+        </w:rPr>
+        <w:t>Tip para tus alumnos: "Si una sustancia solo aparece en UNA especie, esa especie ES OBLIGATORIA en la respuesta. Búscala primero para descartar opciones falsas de inmediato".</w:t>
+      </w:r>
+    </w:p>
+    <w:p>
+      <w:pPr>
+        <w:rPr>
+          <w:b/>
+          <w:bCs/>
+          <w:lang w:val="es-ES"/>
+        </w:rPr>
+      </w:pPr>
     </w:p>
     <w:p>
       <w:pPr>
@@ -66,6 +3672,155 @@
 <file path=word/numbering.xml><?xml version="1.0" encoding="utf-8"?>
 <w:numbering xmlns:wpc="http://schemas.microsoft.com/office/word/2010/wordprocessingCanvas" xmlns:cx="http://schemas.microsoft.com/office/drawing/2014/chartex" xmlns:cx1="http://schemas.microsoft.com/office/drawing/2015/9/8/chartex" xmlns:cx2="http://schemas.microsoft.com/office/drawing/2015/10/21/chartex" xmlns:cx3="http://schemas.microsoft.com/office/drawing/2016/5/9/chartex" xmlns:cx4="http://schemas.microsoft.com/office/drawing/2016/5/10/chartex" xmlns:cx5="http://schemas.microsoft.com/office/drawing/2016/5/11/chartex" xmlns:cx6="http://schemas.microsoft.com/office/drawing/2016/5/12/chartex" xmlns:cx7="http://schemas.microsoft.com/office/drawing/2016/5/13/chartex" xmlns:cx8="http://schemas.microsoft.com/office/drawing/2016/5/14/chartex" xmlns:mc="http://schemas.openxmlformats.org/markup-compatibility/2006" xmlns:aink="http://schemas.microsoft.com/office/drawing/2016/ink" xmlns:am3d="http://schemas.microsoft.com/office/drawing/2017/model3d" xmlns:o="urn:schemas-microsoft-com:office:office" xmlns:oel="http://schemas.microsoft.com/office/2019/extlst" xmlns:r="http://schemas.openxmlformats.org/officeDocument/2006/relationships" xmlns:m="http://schemas.openxmlformats.org/officeDocument/2006/math" xmlns:v="urn:schemas-microsoft-com:vml" xmlns:wp14="http://schemas.microsoft.com/office/word/2010/wordprocessingDrawing" xmlns:wp="http://schemas.openxmlformats.org/drawingml/2006/wordprocessingDrawing" xmlns:w10="urn:schemas-microsoft-com:office:word" xmlns:w="http://schemas.openxmlformats.org/wordprocessingml/2006/main" xmlns:w14="http://schemas.microsoft.com/office/word/2010/wordml" xmlns:w15="http://schemas.microsoft.com/office/word/2012/wordml" xmlns:w16cex="http://schemas.microsoft.com/office/word/2018/wordml/cex" xmlns:w16cid="http://schemas.microsoft.com/office/word/2016/wordml/cid" xmlns:w16="http://schemas.microsoft.com/office/word/2018/wordml" xmlns:w16du="http://schemas.microsoft.com/office/word/2023/wordml/word16du" xmlns:w16sdtdh="http://schemas.microsoft.com/office/word/2020/wordml/sdtdatahash" xmlns:w16sdtfl="http://schemas.microsoft.com/office/word/2024/wordml/sdtformatlock" xmlns:w16se="http://schemas.microsoft.com/office/word/2015/wordml/symex" xmlns:wpg="http://schemas.microsoft.com/office/word/2010/wordprocessingGroup" xmlns:wpi="http://schemas.microsoft.com/office/word/2010/wordprocessingInk" xmlns:wne="http://schemas.microsoft.com/office/word/2006/wordml" xmlns:wps="http://schemas.microsoft.com/office/word/2010/wordprocessingShape" mc:Ignorable="w14 w15 w16se w16cid w16 w16cex w16sdtdh w16sdtfl w16du wp14">
   <w:abstractNum w:abstractNumId="0" w15:restartNumberingAfterBreak="0">
+    <w:nsid w:val="04136C6A"/>
+    <w:multiLevelType w:val="multilevel"/>
+    <w:tmpl w:val="D4E29AC2"/>
+    <w:lvl w:ilvl="0">
+      <w:start w:val="1"/>
+      <w:numFmt w:val="bullet"/>
+      <w:lvlText w:val=""/>
+      <w:lvlJc w:val="left"/>
+      <w:pPr>
+        <w:tabs>
+          <w:tab w:val="num" w:pos="720"/>
+        </w:tabs>
+        <w:ind w:left="720" w:hanging="360"/>
+      </w:pPr>
+      <w:rPr>
+        <w:rFonts w:ascii="Symbol" w:hAnsi="Symbol" w:hint="default"/>
+        <w:sz w:val="20"/>
+      </w:rPr>
+    </w:lvl>
+    <w:lvl w:ilvl="1" w:tentative="1">
+      <w:start w:val="1"/>
+      <w:numFmt w:val="bullet"/>
+      <w:lvlText w:val="o"/>
+      <w:lvlJc w:val="left"/>
+      <w:pPr>
+        <w:tabs>
+          <w:tab w:val="num" w:pos="1440"/>
+        </w:tabs>
+        <w:ind w:left="1440" w:hanging="360"/>
+      </w:pPr>
+      <w:rPr>
+        <w:rFonts w:ascii="Courier New" w:hAnsi="Courier New" w:hint="default"/>
+        <w:sz w:val="20"/>
+      </w:rPr>
+    </w:lvl>
+    <w:lvl w:ilvl="2" w:tentative="1">
+      <w:start w:val="1"/>
+      <w:numFmt w:val="bullet"/>
+      <w:lvlText w:val=""/>
+      <w:lvlJc w:val="left"/>
+      <w:pPr>
+        <w:tabs>
+          <w:tab w:val="num" w:pos="2160"/>
+        </w:tabs>
+        <w:ind w:left="2160" w:hanging="360"/>
+      </w:pPr>
+      <w:rPr>
+        <w:rFonts w:ascii="Wingdings" w:hAnsi="Wingdings" w:hint="default"/>
+        <w:sz w:val="20"/>
+      </w:rPr>
+    </w:lvl>
+    <w:lvl w:ilvl="3" w:tentative="1">
+      <w:start w:val="1"/>
+      <w:numFmt w:val="bullet"/>
+      <w:lvlText w:val=""/>
+      <w:lvlJc w:val="left"/>
+      <w:pPr>
+        <w:tabs>
+          <w:tab w:val="num" w:pos="2880"/>
+        </w:tabs>
+        <w:ind w:left="2880" w:hanging="360"/>
+      </w:pPr>
+      <w:rPr>
+        <w:rFonts w:ascii="Wingdings" w:hAnsi="Wingdings" w:hint="default"/>
+        <w:sz w:val="20"/>
+      </w:rPr>
+    </w:lvl>
+    <w:lvl w:ilvl="4" w:tentative="1">
+      <w:start w:val="1"/>
+      <w:numFmt w:val="bullet"/>
+      <w:lvlText w:val=""/>
+      <w:lvlJc w:val="left"/>
+      <w:pPr>
+        <w:tabs>
+          <w:tab w:val="num" w:pos="3600"/>
+        </w:tabs>
+        <w:ind w:left="3600" w:hanging="360"/>
+      </w:pPr>
+      <w:rPr>
+        <w:rFonts w:ascii="Wingdings" w:hAnsi="Wingdings" w:hint="default"/>
+        <w:sz w:val="20"/>
+      </w:rPr>
+    </w:lvl>
+    <w:lvl w:ilvl="5" w:tentative="1">
+      <w:start w:val="1"/>
+      <w:numFmt w:val="bullet"/>
+      <w:lvlText w:val=""/>
+      <w:lvlJc w:val="left"/>
+      <w:pPr>
+        <w:tabs>
+          <w:tab w:val="num" w:pos="4320"/>
+        </w:tabs>
+        <w:ind w:left="4320" w:hanging="360"/>
+      </w:pPr>
+      <w:rPr>
+        <w:rFonts w:ascii="Wingdings" w:hAnsi="Wingdings" w:hint="default"/>
+        <w:sz w:val="20"/>
+      </w:rPr>
+    </w:lvl>
+    <w:lvl w:ilvl="6" w:tentative="1">
+      <w:start w:val="1"/>
+      <w:numFmt w:val="bullet"/>
+      <w:lvlText w:val=""/>
+      <w:lvlJc w:val="left"/>
+      <w:pPr>
+        <w:tabs>
+          <w:tab w:val="num" w:pos="5040"/>
+        </w:tabs>
+        <w:ind w:left="5040" w:hanging="360"/>
+      </w:pPr>
+      <w:rPr>
+        <w:rFonts w:ascii="Wingdings" w:hAnsi="Wingdings" w:hint="default"/>
+        <w:sz w:val="20"/>
+      </w:rPr>
+    </w:lvl>
+    <w:lvl w:ilvl="7" w:tentative="1">
+      <w:start w:val="1"/>
+      <w:numFmt w:val="bullet"/>
+      <w:lvlText w:val=""/>
+      <w:lvlJc w:val="left"/>
+      <w:pPr>
+        <w:tabs>
+          <w:tab w:val="num" w:pos="5760"/>
+        </w:tabs>
+        <w:ind w:left="5760" w:hanging="360"/>
+      </w:pPr>
+      <w:rPr>
+        <w:rFonts w:ascii="Wingdings" w:hAnsi="Wingdings" w:hint="default"/>
+        <w:sz w:val="20"/>
+      </w:rPr>
+    </w:lvl>
+    <w:lvl w:ilvl="8" w:tentative="1">
+      <w:start w:val="1"/>
+      <w:numFmt w:val="bullet"/>
+      <w:lvlText w:val=""/>
+      <w:lvlJc w:val="left"/>
+      <w:pPr>
+        <w:tabs>
+          <w:tab w:val="num" w:pos="6480"/>
+        </w:tabs>
+        <w:ind w:left="6480" w:hanging="360"/>
+      </w:pPr>
+      <w:rPr>
+        <w:rFonts w:ascii="Wingdings" w:hAnsi="Wingdings" w:hint="default"/>
+        <w:sz w:val="20"/>
+      </w:rPr>
+    </w:lvl>
+  </w:abstractNum>
+  <w:abstractNum w:abstractNumId="1" w15:restartNumberingAfterBreak="0">
     <w:nsid w:val="056D592C"/>
     <w:multiLevelType w:val="multilevel"/>
     <w:tmpl w:val="81980986"/>
@@ -214,7 +3969,7 @@
       </w:rPr>
     </w:lvl>
   </w:abstractNum>
-  <w:abstractNum w:abstractNumId="1" w15:restartNumberingAfterBreak="0">
+  <w:abstractNum w:abstractNumId="2" w15:restartNumberingAfterBreak="0">
     <w:nsid w:val="297813F9"/>
     <w:multiLevelType w:val="multilevel"/>
     <w:tmpl w:val="C3B23096"/>
@@ -363,7 +4118,7 @@
       </w:rPr>
     </w:lvl>
   </w:abstractNum>
-  <w:abstractNum w:abstractNumId="2" w15:restartNumberingAfterBreak="0">
+  <w:abstractNum w:abstractNumId="3" w15:restartNumberingAfterBreak="0">
     <w:nsid w:val="3BFD1717"/>
     <w:multiLevelType w:val="multilevel"/>
     <w:tmpl w:val="DFB0E7D8"/>
@@ -512,7 +4267,124 @@
       </w:rPr>
     </w:lvl>
   </w:abstractNum>
-  <w:abstractNum w:abstractNumId="3" w15:restartNumberingAfterBreak="0">
+  <w:abstractNum w:abstractNumId="4" w15:restartNumberingAfterBreak="0">
+    <w:nsid w:val="40D14EC6"/>
+    <w:multiLevelType w:val="multilevel"/>
+    <w:tmpl w:val="6F4C4ACE"/>
+    <w:lvl w:ilvl="0">
+      <w:start w:val="1"/>
+      <w:numFmt w:val="decimal"/>
+      <w:lvlText w:val="%1."/>
+      <w:lvlJc w:val="left"/>
+      <w:pPr>
+        <w:tabs>
+          <w:tab w:val="num" w:pos="720"/>
+        </w:tabs>
+        <w:ind w:left="720" w:hanging="360"/>
+      </w:pPr>
+    </w:lvl>
+    <w:lvl w:ilvl="1">
+      <w:start w:val="1"/>
+      <w:numFmt w:val="bullet"/>
+      <w:lvlText w:val="o"/>
+      <w:lvlJc w:val="left"/>
+      <w:pPr>
+        <w:tabs>
+          <w:tab w:val="num" w:pos="1440"/>
+        </w:tabs>
+        <w:ind w:left="1440" w:hanging="360"/>
+      </w:pPr>
+      <w:rPr>
+        <w:rFonts w:ascii="Courier New" w:hAnsi="Courier New" w:hint="default"/>
+        <w:sz w:val="20"/>
+      </w:rPr>
+    </w:lvl>
+    <w:lvl w:ilvl="2" w:tentative="1">
+      <w:start w:val="1"/>
+      <w:numFmt w:val="decimal"/>
+      <w:lvlText w:val="%3."/>
+      <w:lvlJc w:val="left"/>
+      <w:pPr>
+        <w:tabs>
+          <w:tab w:val="num" w:pos="2160"/>
+        </w:tabs>
+        <w:ind w:left="2160" w:hanging="360"/>
+      </w:pPr>
+    </w:lvl>
+    <w:lvl w:ilvl="3" w:tentative="1">
+      <w:start w:val="1"/>
+      <w:numFmt w:val="decimal"/>
+      <w:lvlText w:val="%4."/>
+      <w:lvlJc w:val="left"/>
+      <w:pPr>
+        <w:tabs>
+          <w:tab w:val="num" w:pos="2880"/>
+        </w:tabs>
+        <w:ind w:left="2880" w:hanging="360"/>
+      </w:pPr>
+    </w:lvl>
+    <w:lvl w:ilvl="4" w:tentative="1">
+      <w:start w:val="1"/>
+      <w:numFmt w:val="decimal"/>
+      <w:lvlText w:val="%5."/>
+      <w:lvlJc w:val="left"/>
+      <w:pPr>
+        <w:tabs>
+          <w:tab w:val="num" w:pos="3600"/>
+        </w:tabs>
+        <w:ind w:left="3600" w:hanging="360"/>
+      </w:pPr>
+    </w:lvl>
+    <w:lvl w:ilvl="5" w:tentative="1">
+      <w:start w:val="1"/>
+      <w:numFmt w:val="decimal"/>
+      <w:lvlText w:val="%6."/>
+      <w:lvlJc w:val="left"/>
+      <w:pPr>
+        <w:tabs>
+          <w:tab w:val="num" w:pos="4320"/>
+        </w:tabs>
+        <w:ind w:left="4320" w:hanging="360"/>
+      </w:pPr>
+    </w:lvl>
+    <w:lvl w:ilvl="6" w:tentative="1">
+      <w:start w:val="1"/>
+      <w:numFmt w:val="decimal"/>
+      <w:lvlText w:val="%7."/>
+      <w:lvlJc w:val="left"/>
+      <w:pPr>
+        <w:tabs>
+          <w:tab w:val="num" w:pos="5040"/>
+        </w:tabs>
+        <w:ind w:left="5040" w:hanging="360"/>
+      </w:pPr>
+    </w:lvl>
+    <w:lvl w:ilvl="7" w:tentative="1">
+      <w:start w:val="1"/>
+      <w:numFmt w:val="decimal"/>
+      <w:lvlText w:val="%8."/>
+      <w:lvlJc w:val="left"/>
+      <w:pPr>
+        <w:tabs>
+          <w:tab w:val="num" w:pos="5760"/>
+        </w:tabs>
+        <w:ind w:left="5760" w:hanging="360"/>
+      </w:pPr>
+    </w:lvl>
+    <w:lvl w:ilvl="8" w:tentative="1">
+      <w:start w:val="1"/>
+      <w:numFmt w:val="decimal"/>
+      <w:lvlText w:val="%9."/>
+      <w:lvlJc w:val="left"/>
+      <w:pPr>
+        <w:tabs>
+          <w:tab w:val="num" w:pos="6480"/>
+        </w:tabs>
+        <w:ind w:left="6480" w:hanging="360"/>
+      </w:pPr>
+    </w:lvl>
+  </w:abstractNum>
+  <w:abstractNum w:abstractNumId="5" w15:restartNumberingAfterBreak="0">
     <w:nsid w:val="44A47CEE"/>
     <w:multiLevelType w:val="multilevel"/>
     <w:tmpl w:val="0304EC74"/>
@@ -661,7 +4533,603 @@
       </w:rPr>
     </w:lvl>
   </w:abstractNum>
-  <w:abstractNum w:abstractNumId="4" w15:restartNumberingAfterBreak="0">
+  <w:abstractNum w:abstractNumId="6" w15:restartNumberingAfterBreak="0">
+    <w:nsid w:val="49B143E5"/>
+    <w:multiLevelType w:val="multilevel"/>
+    <w:tmpl w:val="F5DED452"/>
+    <w:lvl w:ilvl="0">
+      <w:start w:val="1"/>
+      <w:numFmt w:val="bullet"/>
+      <w:lvlText w:val=""/>
+      <w:lvlJc w:val="left"/>
+      <w:pPr>
+        <w:tabs>
+          <w:tab w:val="num" w:pos="720"/>
+        </w:tabs>
+        <w:ind w:left="720" w:hanging="360"/>
+      </w:pPr>
+      <w:rPr>
+        <w:rFonts w:ascii="Symbol" w:hAnsi="Symbol" w:hint="default"/>
+        <w:sz w:val="20"/>
+      </w:rPr>
+    </w:lvl>
+    <w:lvl w:ilvl="1" w:tentative="1">
+      <w:start w:val="1"/>
+      <w:numFmt w:val="bullet"/>
+      <w:lvlText w:val="o"/>
+      <w:lvlJc w:val="left"/>
+      <w:pPr>
+        <w:tabs>
+          <w:tab w:val="num" w:pos="1440"/>
+        </w:tabs>
+        <w:ind w:left="1440" w:hanging="360"/>
+      </w:pPr>
+      <w:rPr>
+        <w:rFonts w:ascii="Courier New" w:hAnsi="Courier New" w:hint="default"/>
+        <w:sz w:val="20"/>
+      </w:rPr>
+    </w:lvl>
+    <w:lvl w:ilvl="2" w:tentative="1">
+      <w:start w:val="1"/>
+      <w:numFmt w:val="bullet"/>
+      <w:lvlText w:val=""/>
+      <w:lvlJc w:val="left"/>
+      <w:pPr>
+        <w:tabs>
+          <w:tab w:val="num" w:pos="2160"/>
+        </w:tabs>
+        <w:ind w:left="2160" w:hanging="360"/>
+      </w:pPr>
+      <w:rPr>
+        <w:rFonts w:ascii="Wingdings" w:hAnsi="Wingdings" w:hint="default"/>
+        <w:sz w:val="20"/>
+      </w:rPr>
+    </w:lvl>
+    <w:lvl w:ilvl="3" w:tentative="1">
+      <w:start w:val="1"/>
+      <w:numFmt w:val="bullet"/>
+      <w:lvlText w:val=""/>
+      <w:lvlJc w:val="left"/>
+      <w:pPr>
+        <w:tabs>
+          <w:tab w:val="num" w:pos="2880"/>
+        </w:tabs>
+        <w:ind w:left="2880" w:hanging="360"/>
+      </w:pPr>
+      <w:rPr>
+        <w:rFonts w:ascii="Wingdings" w:hAnsi="Wingdings" w:hint="default"/>
+        <w:sz w:val="20"/>
+      </w:rPr>
+    </w:lvl>
+    <w:lvl w:ilvl="4" w:tentative="1">
+      <w:start w:val="1"/>
+      <w:numFmt w:val="bullet"/>
+      <w:lvlText w:val=""/>
+      <w:lvlJc w:val="left"/>
+      <w:pPr>
+        <w:tabs>
+          <w:tab w:val="num" w:pos="3600"/>
+        </w:tabs>
+        <w:ind w:left="3600" w:hanging="360"/>
+      </w:pPr>
+      <w:rPr>
+        <w:rFonts w:ascii="Wingdings" w:hAnsi="Wingdings" w:hint="default"/>
+        <w:sz w:val="20"/>
+      </w:rPr>
+    </w:lvl>
+    <w:lvl w:ilvl="5" w:tentative="1">
+      <w:start w:val="1"/>
+      <w:numFmt w:val="bullet"/>
+      <w:lvlText w:val=""/>
+      <w:lvlJc w:val="left"/>
+      <w:pPr>
+        <w:tabs>
+          <w:tab w:val="num" w:pos="4320"/>
+        </w:tabs>
+        <w:ind w:left="4320" w:hanging="360"/>
+      </w:pPr>
+      <w:rPr>
+        <w:rFonts w:ascii="Wingdings" w:hAnsi="Wingdings" w:hint="default"/>
+        <w:sz w:val="20"/>
+      </w:rPr>
+    </w:lvl>
+    <w:lvl w:ilvl="6" w:tentative="1">
+      <w:start w:val="1"/>
+      <w:numFmt w:val="bullet"/>
+      <w:lvlText w:val=""/>
+      <w:lvlJc w:val="left"/>
+      <w:pPr>
+        <w:tabs>
+          <w:tab w:val="num" w:pos="5040"/>
+        </w:tabs>
+        <w:ind w:left="5040" w:hanging="360"/>
+      </w:pPr>
+      <w:rPr>
+        <w:rFonts w:ascii="Wingdings" w:hAnsi="Wingdings" w:hint="default"/>
+        <w:sz w:val="20"/>
+      </w:rPr>
+    </w:lvl>
+    <w:lvl w:ilvl="7" w:tentative="1">
+      <w:start w:val="1"/>
+      <w:numFmt w:val="bullet"/>
+      <w:lvlText w:val=""/>
+      <w:lvlJc w:val="left"/>
+      <w:pPr>
+        <w:tabs>
+          <w:tab w:val="num" w:pos="5760"/>
+        </w:tabs>
+        <w:ind w:left="5760" w:hanging="360"/>
+      </w:pPr>
+      <w:rPr>
+        <w:rFonts w:ascii="Wingdings" w:hAnsi="Wingdings" w:hint="default"/>
+        <w:sz w:val="20"/>
+      </w:rPr>
+    </w:lvl>
+    <w:lvl w:ilvl="8" w:tentative="1">
+      <w:start w:val="1"/>
+      <w:numFmt w:val="bullet"/>
+      <w:lvlText w:val=""/>
+      <w:lvlJc w:val="left"/>
+      <w:pPr>
+        <w:tabs>
+          <w:tab w:val="num" w:pos="6480"/>
+        </w:tabs>
+        <w:ind w:left="6480" w:hanging="360"/>
+      </w:pPr>
+      <w:rPr>
+        <w:rFonts w:ascii="Wingdings" w:hAnsi="Wingdings" w:hint="default"/>
+        <w:sz w:val="20"/>
+      </w:rPr>
+    </w:lvl>
+  </w:abstractNum>
+  <w:abstractNum w:abstractNumId="7" w15:restartNumberingAfterBreak="0">
+    <w:nsid w:val="55223D1C"/>
+    <w:multiLevelType w:val="multilevel"/>
+    <w:tmpl w:val="1D465C8A"/>
+    <w:lvl w:ilvl="0">
+      <w:start w:val="1"/>
+      <w:numFmt w:val="bullet"/>
+      <w:lvlText w:val=""/>
+      <w:lvlJc w:val="left"/>
+      <w:pPr>
+        <w:tabs>
+          <w:tab w:val="num" w:pos="720"/>
+        </w:tabs>
+        <w:ind w:left="720" w:hanging="360"/>
+      </w:pPr>
+      <w:rPr>
+        <w:rFonts w:ascii="Symbol" w:hAnsi="Symbol" w:hint="default"/>
+        <w:sz w:val="20"/>
+      </w:rPr>
+    </w:lvl>
+    <w:lvl w:ilvl="1" w:tentative="1">
+      <w:start w:val="1"/>
+      <w:numFmt w:val="bullet"/>
+      <w:lvlText w:val="o"/>
+      <w:lvlJc w:val="left"/>
+      <w:pPr>
+        <w:tabs>
+          <w:tab w:val="num" w:pos="1440"/>
+        </w:tabs>
+        <w:ind w:left="1440" w:hanging="360"/>
+      </w:pPr>
+      <w:rPr>
+        <w:rFonts w:ascii="Courier New" w:hAnsi="Courier New" w:hint="default"/>
+        <w:sz w:val="20"/>
+      </w:rPr>
+    </w:lvl>
+    <w:lvl w:ilvl="2" w:tentative="1">
+      <w:start w:val="1"/>
+      <w:numFmt w:val="bullet"/>
+      <w:lvlText w:val=""/>
+      <w:lvlJc w:val="left"/>
+      <w:pPr>
+        <w:tabs>
+          <w:tab w:val="num" w:pos="2160"/>
+        </w:tabs>
+        <w:ind w:left="2160" w:hanging="360"/>
+      </w:pPr>
+      <w:rPr>
+        <w:rFonts w:ascii="Wingdings" w:hAnsi="Wingdings" w:hint="default"/>
+        <w:sz w:val="20"/>
+      </w:rPr>
+    </w:lvl>
+    <w:lvl w:ilvl="3" w:tentative="1">
+      <w:start w:val="1"/>
+      <w:numFmt w:val="bullet"/>
+      <w:lvlText w:val=""/>
+      <w:lvlJc w:val="left"/>
+      <w:pPr>
+        <w:tabs>
+          <w:tab w:val="num" w:pos="2880"/>
+        </w:tabs>
+        <w:ind w:left="2880" w:hanging="360"/>
+      </w:pPr>
+      <w:rPr>
+        <w:rFonts w:ascii="Wingdings" w:hAnsi="Wingdings" w:hint="default"/>
+        <w:sz w:val="20"/>
+      </w:rPr>
+    </w:lvl>
+    <w:lvl w:ilvl="4" w:tentative="1">
+      <w:start w:val="1"/>
+      <w:numFmt w:val="bullet"/>
+      <w:lvlText w:val=""/>
+      <w:lvlJc w:val="left"/>
+      <w:pPr>
+        <w:tabs>
+          <w:tab w:val="num" w:pos="3600"/>
+        </w:tabs>
+        <w:ind w:left="3600" w:hanging="360"/>
+      </w:pPr>
+      <w:rPr>
+        <w:rFonts w:ascii="Wingdings" w:hAnsi="Wingdings" w:hint="default"/>
+        <w:sz w:val="20"/>
+      </w:rPr>
+    </w:lvl>
+    <w:lvl w:ilvl="5" w:tentative="1">
+      <w:start w:val="1"/>
+      <w:numFmt w:val="bullet"/>
+      <w:lvlText w:val=""/>
+      <w:lvlJc w:val="left"/>
+      <w:pPr>
+        <w:tabs>
+          <w:tab w:val="num" w:pos="4320"/>
+        </w:tabs>
+        <w:ind w:left="4320" w:hanging="360"/>
+      </w:pPr>
+      <w:rPr>
+        <w:rFonts w:ascii="Wingdings" w:hAnsi="Wingdings" w:hint="default"/>
+        <w:sz w:val="20"/>
+      </w:rPr>
+    </w:lvl>
+    <w:lvl w:ilvl="6" w:tentative="1">
+      <w:start w:val="1"/>
+      <w:numFmt w:val="bullet"/>
+      <w:lvlText w:val=""/>
+      <w:lvlJc w:val="left"/>
+      <w:pPr>
+        <w:tabs>
+          <w:tab w:val="num" w:pos="5040"/>
+        </w:tabs>
+        <w:ind w:left="5040" w:hanging="360"/>
+      </w:pPr>
+      <w:rPr>
+        <w:rFonts w:ascii="Wingdings" w:hAnsi="Wingdings" w:hint="default"/>
+        <w:sz w:val="20"/>
+      </w:rPr>
+    </w:lvl>
+    <w:lvl w:ilvl="7" w:tentative="1">
+      <w:start w:val="1"/>
+      <w:numFmt w:val="bullet"/>
+      <w:lvlText w:val=""/>
+      <w:lvlJc w:val="left"/>
+      <w:pPr>
+        <w:tabs>
+          <w:tab w:val="num" w:pos="5760"/>
+        </w:tabs>
+        <w:ind w:left="5760" w:hanging="360"/>
+      </w:pPr>
+      <w:rPr>
+        <w:rFonts w:ascii="Wingdings" w:hAnsi="Wingdings" w:hint="default"/>
+        <w:sz w:val="20"/>
+      </w:rPr>
+    </w:lvl>
+    <w:lvl w:ilvl="8" w:tentative="1">
+      <w:start w:val="1"/>
+      <w:numFmt w:val="bullet"/>
+      <w:lvlText w:val=""/>
+      <w:lvlJc w:val="left"/>
+      <w:pPr>
+        <w:tabs>
+          <w:tab w:val="num" w:pos="6480"/>
+        </w:tabs>
+        <w:ind w:left="6480" w:hanging="360"/>
+      </w:pPr>
+      <w:rPr>
+        <w:rFonts w:ascii="Wingdings" w:hAnsi="Wingdings" w:hint="default"/>
+        <w:sz w:val="20"/>
+      </w:rPr>
+    </w:lvl>
+  </w:abstractNum>
+  <w:abstractNum w:abstractNumId="8" w15:restartNumberingAfterBreak="0">
+    <w:nsid w:val="56164DE8"/>
+    <w:multiLevelType w:val="multilevel"/>
+    <w:tmpl w:val="1C0AEFF4"/>
+    <w:lvl w:ilvl="0">
+      <w:start w:val="1"/>
+      <w:numFmt w:val="bullet"/>
+      <w:lvlText w:val=""/>
+      <w:lvlJc w:val="left"/>
+      <w:pPr>
+        <w:tabs>
+          <w:tab w:val="num" w:pos="720"/>
+        </w:tabs>
+        <w:ind w:left="720" w:hanging="360"/>
+      </w:pPr>
+      <w:rPr>
+        <w:rFonts w:ascii="Symbol" w:hAnsi="Symbol" w:hint="default"/>
+        <w:sz w:val="20"/>
+      </w:rPr>
+    </w:lvl>
+    <w:lvl w:ilvl="1" w:tentative="1">
+      <w:start w:val="1"/>
+      <w:numFmt w:val="bullet"/>
+      <w:lvlText w:val="o"/>
+      <w:lvlJc w:val="left"/>
+      <w:pPr>
+        <w:tabs>
+          <w:tab w:val="num" w:pos="1440"/>
+        </w:tabs>
+        <w:ind w:left="1440" w:hanging="360"/>
+      </w:pPr>
+      <w:rPr>
+        <w:rFonts w:ascii="Courier New" w:hAnsi="Courier New" w:hint="default"/>
+        <w:sz w:val="20"/>
+      </w:rPr>
+    </w:lvl>
+    <w:lvl w:ilvl="2" w:tentative="1">
+      <w:start w:val="1"/>
+      <w:numFmt w:val="bullet"/>
+      <w:lvlText w:val=""/>
+      <w:lvlJc w:val="left"/>
+      <w:pPr>
+        <w:tabs>
+          <w:tab w:val="num" w:pos="2160"/>
+        </w:tabs>
+        <w:ind w:left="2160" w:hanging="360"/>
+      </w:pPr>
+      <w:rPr>
+        <w:rFonts w:ascii="Wingdings" w:hAnsi="Wingdings" w:hint="default"/>
+        <w:sz w:val="20"/>
+      </w:rPr>
+    </w:lvl>
+    <w:lvl w:ilvl="3" w:tentative="1">
+      <w:start w:val="1"/>
+      <w:numFmt w:val="bullet"/>
+      <w:lvlText w:val=""/>
+      <w:lvlJc w:val="left"/>
+      <w:pPr>
+        <w:tabs>
+          <w:tab w:val="num" w:pos="2880"/>
+        </w:tabs>
+        <w:ind w:left="2880" w:hanging="360"/>
+      </w:pPr>
+      <w:rPr>
+        <w:rFonts w:ascii="Wingdings" w:hAnsi="Wingdings" w:hint="default"/>
+        <w:sz w:val="20"/>
+      </w:rPr>
+    </w:lvl>
+    <w:lvl w:ilvl="4" w:tentative="1">
+      <w:start w:val="1"/>
+      <w:numFmt w:val="bullet"/>
+      <w:lvlText w:val=""/>
+      <w:lvlJc w:val="left"/>
+      <w:pPr>
+        <w:tabs>
+          <w:tab w:val="num" w:pos="3600"/>
+        </w:tabs>
+        <w:ind w:left="3600" w:hanging="360"/>
+      </w:pPr>
+      <w:rPr>
+        <w:rFonts w:ascii="Wingdings" w:hAnsi="Wingdings" w:hint="default"/>
+        <w:sz w:val="20"/>
+      </w:rPr>
+    </w:lvl>
+    <w:lvl w:ilvl="5" w:tentative="1">
+      <w:start w:val="1"/>
+      <w:numFmt w:val="bullet"/>
+      <w:lvlText w:val=""/>
+      <w:lvlJc w:val="left"/>
+      <w:pPr>
+        <w:tabs>
+          <w:tab w:val="num" w:pos="4320"/>
+        </w:tabs>
+        <w:ind w:left="4320" w:hanging="360"/>
+      </w:pPr>
+      <w:rPr>
+        <w:rFonts w:ascii="Wingdings" w:hAnsi="Wingdings" w:hint="default"/>
+        <w:sz w:val="20"/>
+      </w:rPr>
+    </w:lvl>
+    <w:lvl w:ilvl="6" w:tentative="1">
+      <w:start w:val="1"/>
+      <w:numFmt w:val="bullet"/>
+      <w:lvlText w:val=""/>
+      <w:lvlJc w:val="left"/>
+      <w:pPr>
+        <w:tabs>
+          <w:tab w:val="num" w:pos="5040"/>
+        </w:tabs>
+        <w:ind w:left="5040" w:hanging="360"/>
+      </w:pPr>
+      <w:rPr>
+        <w:rFonts w:ascii="Wingdings" w:hAnsi="Wingdings" w:hint="default"/>
+        <w:sz w:val="20"/>
+      </w:rPr>
+    </w:lvl>
+    <w:lvl w:ilvl="7" w:tentative="1">
+      <w:start w:val="1"/>
+      <w:numFmt w:val="bullet"/>
+      <w:lvlText w:val=""/>
+      <w:lvlJc w:val="left"/>
+      <w:pPr>
+        <w:tabs>
+          <w:tab w:val="num" w:pos="5760"/>
+        </w:tabs>
+        <w:ind w:left="5760" w:hanging="360"/>
+      </w:pPr>
+      <w:rPr>
+        <w:rFonts w:ascii="Wingdings" w:hAnsi="Wingdings" w:hint="default"/>
+        <w:sz w:val="20"/>
+      </w:rPr>
+    </w:lvl>
+    <w:lvl w:ilvl="8" w:tentative="1">
+      <w:start w:val="1"/>
+      <w:numFmt w:val="bullet"/>
+      <w:lvlText w:val=""/>
+      <w:lvlJc w:val="left"/>
+      <w:pPr>
+        <w:tabs>
+          <w:tab w:val="num" w:pos="6480"/>
+        </w:tabs>
+        <w:ind w:left="6480" w:hanging="360"/>
+      </w:pPr>
+      <w:rPr>
+        <w:rFonts w:ascii="Wingdings" w:hAnsi="Wingdings" w:hint="default"/>
+        <w:sz w:val="20"/>
+      </w:rPr>
+    </w:lvl>
+  </w:abstractNum>
+  <w:abstractNum w:abstractNumId="9" w15:restartNumberingAfterBreak="0">
+    <w:nsid w:val="6A800818"/>
+    <w:multiLevelType w:val="multilevel"/>
+    <w:tmpl w:val="85B4BC2E"/>
+    <w:lvl w:ilvl="0">
+      <w:start w:val="1"/>
+      <w:numFmt w:val="bullet"/>
+      <w:lvlText w:val=""/>
+      <w:lvlJc w:val="left"/>
+      <w:pPr>
+        <w:tabs>
+          <w:tab w:val="num" w:pos="720"/>
+        </w:tabs>
+        <w:ind w:left="720" w:hanging="360"/>
+      </w:pPr>
+      <w:rPr>
+        <w:rFonts w:ascii="Symbol" w:hAnsi="Symbol" w:hint="default"/>
+        <w:sz w:val="20"/>
+      </w:rPr>
+    </w:lvl>
+    <w:lvl w:ilvl="1" w:tentative="1">
+      <w:start w:val="1"/>
+      <w:numFmt w:val="bullet"/>
+      <w:lvlText w:val="o"/>
+      <w:lvlJc w:val="left"/>
+      <w:pPr>
+        <w:tabs>
+          <w:tab w:val="num" w:pos="1440"/>
+        </w:tabs>
+        <w:ind w:left="1440" w:hanging="360"/>
+      </w:pPr>
+      <w:rPr>
+        <w:rFonts w:ascii="Courier New" w:hAnsi="Courier New" w:hint="default"/>
+        <w:sz w:val="20"/>
+      </w:rPr>
+    </w:lvl>
+    <w:lvl w:ilvl="2" w:tentative="1">
+      <w:start w:val="1"/>
+      <w:numFmt w:val="bullet"/>
+      <w:lvlText w:val=""/>
+      <w:lvlJc w:val="left"/>
+      <w:pPr>
+        <w:tabs>
+          <w:tab w:val="num" w:pos="2160"/>
+        </w:tabs>
+        <w:ind w:left="2160" w:hanging="360"/>
+      </w:pPr>
+      <w:rPr>
+        <w:rFonts w:ascii="Wingdings" w:hAnsi="Wingdings" w:hint="default"/>
+        <w:sz w:val="20"/>
+      </w:rPr>
+    </w:lvl>
+    <w:lvl w:ilvl="3" w:tentative="1">
+      <w:start w:val="1"/>
+      <w:numFmt w:val="bullet"/>
+      <w:lvlText w:val=""/>
+      <w:lvlJc w:val="left"/>
+      <w:pPr>
+        <w:tabs>
+          <w:tab w:val="num" w:pos="2880"/>
+        </w:tabs>
+        <w:ind w:left="2880" w:hanging="360"/>
+      </w:pPr>
+      <w:rPr>
+        <w:rFonts w:ascii="Wingdings" w:hAnsi="Wingdings" w:hint="default"/>
+        <w:sz w:val="20"/>
+      </w:rPr>
+    </w:lvl>
+    <w:lvl w:ilvl="4" w:tentative="1">
+      <w:start w:val="1"/>
+      <w:numFmt w:val="bullet"/>
+      <w:lvlText w:val=""/>
+      <w:lvlJc w:val="left"/>
+      <w:pPr>
+        <w:tabs>
+          <w:tab w:val="num" w:pos="3600"/>
+        </w:tabs>
+        <w:ind w:left="3600" w:hanging="360"/>
+      </w:pPr>
+      <w:rPr>
+        <w:rFonts w:ascii="Wingdings" w:hAnsi="Wingdings" w:hint="default"/>
+        <w:sz w:val="20"/>
+      </w:rPr>
+    </w:lvl>
+    <w:lvl w:ilvl="5" w:tentative="1">
+      <w:start w:val="1"/>
+      <w:numFmt w:val="bullet"/>
+      <w:lvlText w:val=""/>
+      <w:lvlJc w:val="left"/>
+      <w:pPr>
+        <w:tabs>
+          <w:tab w:val="num" w:pos="4320"/>
+        </w:tabs>
+        <w:ind w:left="4320" w:hanging="360"/>
+      </w:pPr>
+      <w:rPr>
+        <w:rFonts w:ascii="Wingdings" w:hAnsi="Wingdings" w:hint="default"/>
+        <w:sz w:val="20"/>
+      </w:rPr>
+    </w:lvl>
+    <w:lvl w:ilvl="6" w:tentative="1">
+      <w:start w:val="1"/>
+      <w:numFmt w:val="bullet"/>
+      <w:lvlText w:val=""/>
+      <w:lvlJc w:val="left"/>
+      <w:pPr>
+        <w:tabs>
+          <w:tab w:val="num" w:pos="5040"/>
+        </w:tabs>
+        <w:ind w:left="5040" w:hanging="360"/>
+      </w:pPr>
+      <w:rPr>
+        <w:rFonts w:ascii="Wingdings" w:hAnsi="Wingdings" w:hint="default"/>
+        <w:sz w:val="20"/>
+      </w:rPr>
+    </w:lvl>
+    <w:lvl w:ilvl="7" w:tentative="1">
+      <w:start w:val="1"/>
+      <w:numFmt w:val="bullet"/>
+      <w:lvlText w:val=""/>
+      <w:lvlJc w:val="left"/>
+      <w:pPr>
+        <w:tabs>
+          <w:tab w:val="num" w:pos="5760"/>
+        </w:tabs>
+        <w:ind w:left="5760" w:hanging="360"/>
+      </w:pPr>
+      <w:rPr>
+        <w:rFonts w:ascii="Wingdings" w:hAnsi="Wingdings" w:hint="default"/>
+        <w:sz w:val="20"/>
+      </w:rPr>
+    </w:lvl>
+    <w:lvl w:ilvl="8" w:tentative="1">
+      <w:start w:val="1"/>
+      <w:numFmt w:val="bullet"/>
+      <w:lvlText w:val=""/>
+      <w:lvlJc w:val="left"/>
+      <w:pPr>
+        <w:tabs>
+          <w:tab w:val="num" w:pos="6480"/>
+        </w:tabs>
+        <w:ind w:left="6480" w:hanging="360"/>
+      </w:pPr>
+      <w:rPr>
+        <w:rFonts w:ascii="Wingdings" w:hAnsi="Wingdings" w:hint="default"/>
+        <w:sz w:val="20"/>
+      </w:rPr>
+    </w:lvl>
+  </w:abstractNum>
+  <w:abstractNum w:abstractNumId="10" w15:restartNumberingAfterBreak="0">
     <w:nsid w:val="7805290C"/>
     <w:multiLevelType w:val="multilevel"/>
     <w:tmpl w:val="D3C82112"/>
@@ -810,20 +5278,158 @@
       </w:rPr>
     </w:lvl>
   </w:abstractNum>
+  <w:abstractNum w:abstractNumId="11" w15:restartNumberingAfterBreak="0">
+    <w:nsid w:val="7D034186"/>
+    <w:multiLevelType w:val="multilevel"/>
+    <w:tmpl w:val="F626B8F8"/>
+    <w:lvl w:ilvl="0">
+      <w:start w:val="1"/>
+      <w:numFmt w:val="decimal"/>
+      <w:lvlText w:val="%1."/>
+      <w:lvlJc w:val="left"/>
+      <w:pPr>
+        <w:tabs>
+          <w:tab w:val="num" w:pos="720"/>
+        </w:tabs>
+        <w:ind w:left="720" w:hanging="360"/>
+      </w:pPr>
+    </w:lvl>
+    <w:lvl w:ilvl="1">
+      <w:start w:val="1"/>
+      <w:numFmt w:val="bullet"/>
+      <w:lvlText w:val="o"/>
+      <w:lvlJc w:val="left"/>
+      <w:pPr>
+        <w:tabs>
+          <w:tab w:val="num" w:pos="1440"/>
+        </w:tabs>
+        <w:ind w:left="1440" w:hanging="360"/>
+      </w:pPr>
+      <w:rPr>
+        <w:rFonts w:ascii="Courier New" w:hAnsi="Courier New" w:hint="default"/>
+        <w:sz w:val="20"/>
+      </w:rPr>
+    </w:lvl>
+    <w:lvl w:ilvl="2" w:tentative="1">
+      <w:start w:val="1"/>
+      <w:numFmt w:val="decimal"/>
+      <w:lvlText w:val="%3."/>
+      <w:lvlJc w:val="left"/>
+      <w:pPr>
+        <w:tabs>
+          <w:tab w:val="num" w:pos="2160"/>
+        </w:tabs>
+        <w:ind w:left="2160" w:hanging="360"/>
+      </w:pPr>
+    </w:lvl>
+    <w:lvl w:ilvl="3" w:tentative="1">
+      <w:start w:val="1"/>
+      <w:numFmt w:val="decimal"/>
+      <w:lvlText w:val="%4."/>
+      <w:lvlJc w:val="left"/>
+      <w:pPr>
+        <w:tabs>
+          <w:tab w:val="num" w:pos="2880"/>
+        </w:tabs>
+        <w:ind w:left="2880" w:hanging="360"/>
+      </w:pPr>
+    </w:lvl>
+    <w:lvl w:ilvl="4" w:tentative="1">
+      <w:start w:val="1"/>
+      <w:numFmt w:val="decimal"/>
+      <w:lvlText w:val="%5."/>
+      <w:lvlJc w:val="left"/>
+      <w:pPr>
+        <w:tabs>
+          <w:tab w:val="num" w:pos="3600"/>
+        </w:tabs>
+        <w:ind w:left="3600" w:hanging="360"/>
+      </w:pPr>
+    </w:lvl>
+    <w:lvl w:ilvl="5" w:tentative="1">
+      <w:start w:val="1"/>
+      <w:numFmt w:val="decimal"/>
+      <w:lvlText w:val="%6."/>
+      <w:lvlJc w:val="left"/>
+      <w:pPr>
+        <w:tabs>
+          <w:tab w:val="num" w:pos="4320"/>
+        </w:tabs>
+        <w:ind w:left="4320" w:hanging="360"/>
+      </w:pPr>
+    </w:lvl>
+    <w:lvl w:ilvl="6" w:tentative="1">
+      <w:start w:val="1"/>
+      <w:numFmt w:val="decimal"/>
+      <w:lvlText w:val="%7."/>
+      <w:lvlJc w:val="left"/>
+      <w:pPr>
+        <w:tabs>
+          <w:tab w:val="num" w:pos="5040"/>
+        </w:tabs>
+        <w:ind w:left="5040" w:hanging="360"/>
+      </w:pPr>
+    </w:lvl>
+    <w:lvl w:ilvl="7" w:tentative="1">
+      <w:start w:val="1"/>
+      <w:numFmt w:val="decimal"/>
+      <w:lvlText w:val="%8."/>
+      <w:lvlJc w:val="left"/>
+      <w:pPr>
+        <w:tabs>
+          <w:tab w:val="num" w:pos="5760"/>
+        </w:tabs>
+        <w:ind w:left="5760" w:hanging="360"/>
+      </w:pPr>
+    </w:lvl>
+    <w:lvl w:ilvl="8" w:tentative="1">
+      <w:start w:val="1"/>
+      <w:numFmt w:val="decimal"/>
+      <w:lvlText w:val="%9."/>
+      <w:lvlJc w:val="left"/>
+      <w:pPr>
+        <w:tabs>
+          <w:tab w:val="num" w:pos="6480"/>
+        </w:tabs>
+        <w:ind w:left="6480" w:hanging="360"/>
+      </w:pPr>
+    </w:lvl>
+  </w:abstractNum>
   <w:num w:numId="1" w16cid:durableId="1903446281">
+    <w:abstractNumId w:val="3"/>
+  </w:num>
+  <w:num w:numId="2" w16cid:durableId="406224039">
     <w:abstractNumId w:val="2"/>
   </w:num>
-  <w:num w:numId="2" w16cid:durableId="406224039">
+  <w:num w:numId="3" w16cid:durableId="153451109">
+    <w:abstractNumId w:val="10"/>
+  </w:num>
+  <w:num w:numId="4" w16cid:durableId="1704553445">
+    <w:abstractNumId w:val="5"/>
+  </w:num>
+  <w:num w:numId="5" w16cid:durableId="1359310279">
     <w:abstractNumId w:val="1"/>
   </w:num>
-  <w:num w:numId="3" w16cid:durableId="153451109">
+  <w:num w:numId="6" w16cid:durableId="166024634">
     <w:abstractNumId w:val="4"/>
   </w:num>
-  <w:num w:numId="4" w16cid:durableId="1704553445">
-    <w:abstractNumId w:val="3"/>
+  <w:num w:numId="7" w16cid:durableId="1318264610">
+    <w:abstractNumId w:val="11"/>
   </w:num>
-  <w:num w:numId="5" w16cid:durableId="1359310279">
+  <w:num w:numId="8" w16cid:durableId="1909606203">
+    <w:abstractNumId w:val="8"/>
+  </w:num>
+  <w:num w:numId="9" w16cid:durableId="1465390748">
+    <w:abstractNumId w:val="9"/>
+  </w:num>
+  <w:num w:numId="10" w16cid:durableId="1180504587">
     <w:abstractNumId w:val="0"/>
+  </w:num>
+  <w:num w:numId="11" w16cid:durableId="1025129801">
+    <w:abstractNumId w:val="7"/>
+  </w:num>
+  <w:num w:numId="12" w16cid:durableId="2058822741">
+    <w:abstractNumId w:val="6"/>
   </w:num>
 </w:numbering>
 </file>

</xml_diff>